<commit_message>
dokumentacio frissitve, szures javitva
</commit_message>
<xml_diff>
--- a/Felhasznalói dokumentació.docx
+++ b/Felhasznalói dokumentació.docx
@@ -2941,6 +2941,18 @@
         <w:spacing w:line="360" w:lineRule="auto"/>
         <w:rPr>
           <w:rFonts w:ascii="Times New Roman" w:hAnsi="Times New Roman" w:cs="Times New Roman"/>
+          <w:kern w:val="0"/>
+          <w:sz w:val="24"/>
+          <w:szCs w:val="24"/>
+          <w14:ligatures w14:val="none"/>
+        </w:rPr>
+      </w:pPr>
+    </w:p>
+    <w:p>
+      <w:pPr>
+        <w:spacing w:line="360" w:lineRule="auto"/>
+        <w:rPr>
+          <w:rFonts w:ascii="Times New Roman" w:hAnsi="Times New Roman" w:cs="Times New Roman"/>
           <w:color w:val="EE0000"/>
           <w:sz w:val="26"/>
           <w:szCs w:val="26"/>
@@ -2953,6 +2965,7 @@
           <w:sz w:val="26"/>
           <w:szCs w:val="26"/>
         </w:rPr>
+        <w:lastRenderedPageBreak/>
         <w:t>FONTOS</w:t>
       </w:r>
     </w:p>
@@ -2970,26 +2983,22 @@
       <w:r>
         <w:rPr>
           <w:rFonts w:ascii="Times New Roman" w:hAnsi="Times New Roman" w:cs="Times New Roman"/>
-          <w:i/>
-          <w:iCs/>
-          <w:noProof/>
-          <w:sz w:val="30"/>
-          <w:szCs w:val="30"/>
-        </w:rPr>
-        <w:lastRenderedPageBreak/>
+          <w:sz w:val="24"/>
+          <w:szCs w:val="24"/>
+        </w:rPr>
         <w:drawing>
-          <wp:anchor distT="0" distB="0" distL="114300" distR="114300" simplePos="0" relativeHeight="251728384" behindDoc="0" locked="0" layoutInCell="1" allowOverlap="1" wp14:anchorId="3767669A" wp14:editId="77A4690F">
+          <wp:anchor distT="0" distB="0" distL="114300" distR="114300" simplePos="0" relativeHeight="251808256" behindDoc="0" locked="0" layoutInCell="1" allowOverlap="1" wp14:anchorId="7C5B99DE" wp14:editId="52235EBF">
             <wp:simplePos x="0" y="0"/>
-            <wp:positionH relativeFrom="column">
-              <wp:posOffset>3028315</wp:posOffset>
+            <wp:positionH relativeFrom="margin">
+              <wp:posOffset>-152400</wp:posOffset>
             </wp:positionH>
             <wp:positionV relativeFrom="paragraph">
-              <wp:posOffset>1008380</wp:posOffset>
+              <wp:posOffset>975995</wp:posOffset>
             </wp:positionV>
-            <wp:extent cx="2621280" cy="353060"/>
-            <wp:effectExtent l="190500" t="190500" r="198120" b="199390"/>
+            <wp:extent cx="2952750" cy="480695"/>
+            <wp:effectExtent l="0" t="0" r="0" b="0"/>
             <wp:wrapSquare wrapText="bothSides"/>
-            <wp:docPr id="8" name="Kép 8"/>
+            <wp:docPr id="25" name="Kép 25"/>
             <wp:cNvGraphicFramePr>
               <a:graphicFrameLocks xmlns:a="http://schemas.openxmlformats.org/drawingml/2006/main" noChangeAspect="1"/>
             </wp:cNvGraphicFramePr>
@@ -3015,21 +3024,11 @@
                   <pic:spPr>
                     <a:xfrm>
                       <a:off x="0" y="0"/>
-                      <a:ext cx="2621280" cy="353060"/>
+                      <a:ext cx="2952750" cy="480695"/>
                     </a:xfrm>
                     <a:prstGeom prst="rect">
                       <a:avLst/>
                     </a:prstGeom>
-                    <a:ln>
-                      <a:noFill/>
-                    </a:ln>
-                    <a:effectLst>
-                      <a:outerShdw blurRad="190500" algn="tl" rotWithShape="0">
-                        <a:srgbClr val="000000">
-                          <a:alpha val="70000"/>
-                        </a:srgbClr>
-                      </a:outerShdw>
-                    </a:effectLst>
                   </pic:spPr>
                 </pic:pic>
               </a:graphicData>
@@ -3046,26 +3045,6 @@
       <w:r>
         <w:rPr>
           <w:rFonts w:ascii="Times New Roman" w:hAnsi="Times New Roman" w:cs="Times New Roman"/>
-          <w:kern w:val="0"/>
-          <w:sz w:val="24"/>
-          <w:szCs w:val="24"/>
-          <w14:ligatures w14:val="none"/>
-        </w:rPr>
-        <w:t>Ha és amennyiben a felhasználó nem tölti ki az összes mezőt, vagy a fent leírt feltételek valamelyikének nem tesz eleget, nem lesz lehetősége regisztrálni és egy ehhez társuló hiba üzenetet is kap.</w:t>
-      </w:r>
-    </w:p>
-    <w:p>
-      <w:pPr>
-        <w:spacing w:line="360" w:lineRule="auto"/>
-        <w:rPr>
-          <w:rFonts w:ascii="Times New Roman" w:hAnsi="Times New Roman" w:cs="Times New Roman"/>
-          <w:sz w:val="24"/>
-          <w:szCs w:val="24"/>
-        </w:rPr>
-      </w:pPr>
-      <w:r>
-        <w:rPr>
-          <w:rFonts w:ascii="Times New Roman" w:hAnsi="Times New Roman" w:cs="Times New Roman"/>
           <w:i/>
           <w:iCs/>
           <w:noProof/>
@@ -3073,18 +3052,18 @@
           <w:szCs w:val="30"/>
         </w:rPr>
         <w:drawing>
-          <wp:anchor distT="0" distB="0" distL="114300" distR="114300" simplePos="0" relativeHeight="251729408" behindDoc="0" locked="0" layoutInCell="1" allowOverlap="1" wp14:anchorId="14E237A5" wp14:editId="70318B91">
+          <wp:anchor distT="0" distB="0" distL="114300" distR="114300" simplePos="0" relativeHeight="251807232" behindDoc="0" locked="0" layoutInCell="1" allowOverlap="1" wp14:anchorId="55B7A1F8" wp14:editId="0390B137">
             <wp:simplePos x="0" y="0"/>
             <wp:positionH relativeFrom="column">
-              <wp:posOffset>1038225</wp:posOffset>
+              <wp:posOffset>3043555</wp:posOffset>
             </wp:positionH>
             <wp:positionV relativeFrom="paragraph">
-              <wp:posOffset>771500</wp:posOffset>
+              <wp:posOffset>973455</wp:posOffset>
             </wp:positionV>
-            <wp:extent cx="3776510" cy="819709"/>
-            <wp:effectExtent l="190500" t="190500" r="186055" b="190500"/>
+            <wp:extent cx="2886075" cy="473710"/>
+            <wp:effectExtent l="0" t="0" r="9525" b="2540"/>
             <wp:wrapSquare wrapText="bothSides"/>
-            <wp:docPr id="9" name="Kép 9"/>
+            <wp:docPr id="16" name="Kép 16"/>
             <wp:cNvGraphicFramePr>
               <a:graphicFrameLocks xmlns:a="http://schemas.openxmlformats.org/drawingml/2006/main" noChangeAspect="1"/>
             </wp:cNvGraphicFramePr>
@@ -3110,28 +3089,44 @@
                   <pic:spPr>
                     <a:xfrm>
                       <a:off x="0" y="0"/>
-                      <a:ext cx="3776510" cy="819709"/>
+                      <a:ext cx="2886075" cy="473710"/>
                     </a:xfrm>
                     <a:prstGeom prst="rect">
                       <a:avLst/>
                     </a:prstGeom>
-                    <a:ln>
-                      <a:noFill/>
-                    </a:ln>
-                    <a:effectLst>
-                      <a:outerShdw blurRad="190500" algn="tl" rotWithShape="0">
-                        <a:srgbClr val="000000">
-                          <a:alpha val="70000"/>
-                        </a:srgbClr>
-                      </a:outerShdw>
-                    </a:effectLst>
                   </pic:spPr>
                 </pic:pic>
               </a:graphicData>
             </a:graphic>
+            <wp14:sizeRelH relativeFrom="margin">
+              <wp14:pctWidth>0</wp14:pctWidth>
+            </wp14:sizeRelH>
+            <wp14:sizeRelV relativeFrom="margin">
+              <wp14:pctHeight>0</wp14:pctHeight>
+            </wp14:sizeRelV>
           </wp:anchor>
         </w:drawing>
       </w:r>
+      <w:r>
+        <w:rPr>
+          <w:rFonts w:ascii="Times New Roman" w:hAnsi="Times New Roman" w:cs="Times New Roman"/>
+          <w:kern w:val="0"/>
+          <w:sz w:val="24"/>
+          <w:szCs w:val="24"/>
+          <w14:ligatures w14:val="none"/>
+        </w:rPr>
+        <w:t>Ha és amennyiben a felhasználó nem tölti ki az összes mezőt, vagy a fent leírt feltételek valamelyikének nem tesz eleget, nem lesz lehetősége regisztrálni és egy ehhez társuló hiba üzenetet is kap.</w:t>
+      </w:r>
+    </w:p>
+    <w:p>
+      <w:pPr>
+        <w:spacing w:line="360" w:lineRule="auto"/>
+        <w:rPr>
+          <w:rFonts w:ascii="Times New Roman" w:hAnsi="Times New Roman" w:cs="Times New Roman"/>
+          <w:sz w:val="24"/>
+          <w:szCs w:val="24"/>
+        </w:rPr>
+      </w:pPr>
       <w:r>
         <w:rPr>
           <w:rFonts w:ascii="Times New Roman" w:hAnsi="Times New Roman" w:cs="Times New Roman"/>
@@ -3142,18 +3137,18 @@
           <w:szCs w:val="30"/>
         </w:rPr>
         <w:drawing>
-          <wp:anchor distT="0" distB="0" distL="114300" distR="114300" simplePos="0" relativeHeight="251727360" behindDoc="0" locked="0" layoutInCell="1" allowOverlap="1" wp14:anchorId="681F1E06" wp14:editId="6D6A75E0">
+          <wp:anchor distT="0" distB="0" distL="114300" distR="114300" simplePos="0" relativeHeight="251809280" behindDoc="0" locked="0" layoutInCell="1" allowOverlap="1" wp14:anchorId="6C4E7156" wp14:editId="7A3A458A">
             <wp:simplePos x="0" y="0"/>
-            <wp:positionH relativeFrom="column">
-              <wp:posOffset>22225</wp:posOffset>
+            <wp:positionH relativeFrom="margin">
+              <wp:align>center</wp:align>
             </wp:positionH>
             <wp:positionV relativeFrom="paragraph">
-              <wp:posOffset>135255</wp:posOffset>
+              <wp:posOffset>795655</wp:posOffset>
             </wp:positionV>
-            <wp:extent cx="2750185" cy="333375"/>
-            <wp:effectExtent l="190500" t="190500" r="183515" b="200025"/>
+            <wp:extent cx="3381847" cy="895475"/>
+            <wp:effectExtent l="0" t="0" r="9525" b="0"/>
             <wp:wrapSquare wrapText="bothSides"/>
-            <wp:docPr id="7" name="Kép 7"/>
+            <wp:docPr id="41" name="Kép 41"/>
             <wp:cNvGraphicFramePr>
               <a:graphicFrameLocks xmlns:a="http://schemas.openxmlformats.org/drawingml/2006/main" noChangeAspect="1"/>
             </wp:cNvGraphicFramePr>
@@ -3179,31 +3174,15 @@
                   <pic:spPr>
                     <a:xfrm>
                       <a:off x="0" y="0"/>
-                      <a:ext cx="2750185" cy="333375"/>
+                      <a:ext cx="3381847" cy="895475"/>
                     </a:xfrm>
                     <a:prstGeom prst="rect">
                       <a:avLst/>
                     </a:prstGeom>
-                    <a:ln>
-                      <a:noFill/>
-                    </a:ln>
-                    <a:effectLst>
-                      <a:outerShdw blurRad="190500" algn="tl" rotWithShape="0">
-                        <a:srgbClr val="000000">
-                          <a:alpha val="70000"/>
-                        </a:srgbClr>
-                      </a:outerShdw>
-                    </a:effectLst>
                   </pic:spPr>
                 </pic:pic>
               </a:graphicData>
             </a:graphic>
-            <wp14:sizeRelH relativeFrom="margin">
-              <wp14:pctWidth>0</wp14:pctWidth>
-            </wp14:sizeRelH>
-            <wp14:sizeRelV relativeFrom="margin">
-              <wp14:pctHeight>0</wp14:pctHeight>
-            </wp14:sizeRelV>
           </wp:anchor>
         </w:drawing>
       </w:r>
@@ -3273,7 +3252,23 @@
           <w:sz w:val="24"/>
           <w:szCs w:val="24"/>
         </w:rPr>
-        <w:t>Amennyiben a felhasználó minden adatot helyesen ad meg, a regisztrációja sikeres lesz, melyhez egy siker üzenet is tárul, illetve 1,5 másodperc után visszairányít a bejelentkezéshez, ahonnan tovább lehet majd lépni.</w:t>
+        <w:t>Amennyiben a felhasználó minden adatot helyesen ad meg, a regisztrációja sikeres lesz, melyhez egy siker üzenet is tárul, illetve 1</w:t>
+      </w:r>
+      <w:r>
+        <w:rPr>
+          <w:rFonts w:ascii="Times New Roman" w:hAnsi="Times New Roman" w:cs="Times New Roman"/>
+          <w:sz w:val="24"/>
+          <w:szCs w:val="24"/>
+        </w:rPr>
+        <w:t>.</w:t>
+      </w:r>
+      <w:r>
+        <w:rPr>
+          <w:rFonts w:ascii="Times New Roman" w:hAnsi="Times New Roman" w:cs="Times New Roman"/>
+          <w:sz w:val="24"/>
+          <w:szCs w:val="24"/>
+        </w:rPr>
+        <w:t>5 másodperc után visszairányít a bejelentkezéshez, ahonnan tovább lehet majd lépni.</w:t>
       </w:r>
     </w:p>
     <w:p>
@@ -3288,23 +3283,22 @@
       <w:r>
         <w:rPr>
           <w:rFonts w:ascii="Times New Roman" w:hAnsi="Times New Roman" w:cs="Times New Roman"/>
-          <w:noProof/>
           <w:sz w:val="24"/>
           <w:szCs w:val="24"/>
         </w:rPr>
         <w:drawing>
-          <wp:anchor distT="0" distB="0" distL="114300" distR="114300" simplePos="0" relativeHeight="251732480" behindDoc="0" locked="0" layoutInCell="1" allowOverlap="1" wp14:anchorId="4F312C3E" wp14:editId="3066B872">
+          <wp:anchor distT="0" distB="0" distL="114300" distR="114300" simplePos="0" relativeHeight="251810304" behindDoc="0" locked="0" layoutInCell="1" allowOverlap="1" wp14:anchorId="556DAB51" wp14:editId="252E3283">
             <wp:simplePos x="0" y="0"/>
-            <wp:positionH relativeFrom="column">
-              <wp:posOffset>1330629</wp:posOffset>
+            <wp:positionH relativeFrom="margin">
+              <wp:align>center</wp:align>
             </wp:positionH>
             <wp:positionV relativeFrom="paragraph">
-              <wp:posOffset>23495</wp:posOffset>
+              <wp:posOffset>6350</wp:posOffset>
             </wp:positionV>
-            <wp:extent cx="2991485" cy="449580"/>
-            <wp:effectExtent l="190500" t="190500" r="189865" b="198120"/>
+            <wp:extent cx="3372321" cy="590632"/>
+            <wp:effectExtent l="0" t="0" r="0" b="0"/>
             <wp:wrapSquare wrapText="bothSides"/>
-            <wp:docPr id="10" name="Kép 10"/>
+            <wp:docPr id="42" name="Kép 42"/>
             <wp:cNvGraphicFramePr>
               <a:graphicFrameLocks xmlns:a="http://schemas.openxmlformats.org/drawingml/2006/main" noChangeAspect="1"/>
             </wp:cNvGraphicFramePr>
@@ -3330,31 +3324,15 @@
                   <pic:spPr>
                     <a:xfrm>
                       <a:off x="0" y="0"/>
-                      <a:ext cx="2991485" cy="449580"/>
+                      <a:ext cx="3372321" cy="590632"/>
                     </a:xfrm>
                     <a:prstGeom prst="rect">
                       <a:avLst/>
                     </a:prstGeom>
-                    <a:ln>
-                      <a:noFill/>
-                    </a:ln>
-                    <a:effectLst>
-                      <a:outerShdw blurRad="190500" algn="tl" rotWithShape="0">
-                        <a:srgbClr val="000000">
-                          <a:alpha val="70000"/>
-                        </a:srgbClr>
-                      </a:outerShdw>
-                    </a:effectLst>
                   </pic:spPr>
                 </pic:pic>
               </a:graphicData>
             </a:graphic>
-            <wp14:sizeRelH relativeFrom="margin">
-              <wp14:pctWidth>0</wp14:pctWidth>
-            </wp14:sizeRelH>
-            <wp14:sizeRelV relativeFrom="margin">
-              <wp14:pctHeight>0</wp14:pctHeight>
-            </wp14:sizeRelV>
           </wp:anchor>
         </w:drawing>
       </w:r>
@@ -3384,18 +3362,18 @@
           <w:szCs w:val="24"/>
         </w:rPr>
         <w:drawing>
-          <wp:anchor distT="0" distB="0" distL="114300" distR="114300" simplePos="0" relativeHeight="251733504" behindDoc="0" locked="0" layoutInCell="1" allowOverlap="1" wp14:anchorId="1F3E97FD" wp14:editId="477228CC">
+          <wp:anchor distT="0" distB="0" distL="114300" distR="114300" simplePos="0" relativeHeight="251811328" behindDoc="0" locked="0" layoutInCell="1" allowOverlap="1" wp14:anchorId="716853FE" wp14:editId="2B07F8C0">
             <wp:simplePos x="0" y="0"/>
-            <wp:positionH relativeFrom="column">
-              <wp:posOffset>1113155</wp:posOffset>
+            <wp:positionH relativeFrom="margin">
+              <wp:align>center</wp:align>
             </wp:positionH>
             <wp:positionV relativeFrom="paragraph">
-              <wp:posOffset>565150</wp:posOffset>
+              <wp:posOffset>589915</wp:posOffset>
             </wp:positionV>
-            <wp:extent cx="3702050" cy="438150"/>
-            <wp:effectExtent l="190500" t="190500" r="184150" b="190500"/>
+            <wp:extent cx="2687320" cy="428625"/>
+            <wp:effectExtent l="0" t="0" r="0" b="9525"/>
             <wp:wrapSquare wrapText="bothSides"/>
-            <wp:docPr id="11" name="Kép 11"/>
+            <wp:docPr id="44" name="Kép 44"/>
             <wp:cNvGraphicFramePr>
               <a:graphicFrameLocks xmlns:a="http://schemas.openxmlformats.org/drawingml/2006/main" noChangeAspect="1"/>
             </wp:cNvGraphicFramePr>
@@ -3421,25 +3399,21 @@
                   <pic:spPr>
                     <a:xfrm>
                       <a:off x="0" y="0"/>
-                      <a:ext cx="3702050" cy="438150"/>
+                      <a:ext cx="2687320" cy="428625"/>
                     </a:xfrm>
                     <a:prstGeom prst="rect">
                       <a:avLst/>
                     </a:prstGeom>
-                    <a:ln>
-                      <a:noFill/>
-                    </a:ln>
-                    <a:effectLst>
-                      <a:outerShdw blurRad="190500" algn="tl" rotWithShape="0">
-                        <a:srgbClr val="000000">
-                          <a:alpha val="70000"/>
-                        </a:srgbClr>
-                      </a:outerShdw>
-                    </a:effectLst>
                   </pic:spPr>
                 </pic:pic>
               </a:graphicData>
             </a:graphic>
+            <wp14:sizeRelH relativeFrom="margin">
+              <wp14:pctWidth>0</wp14:pctWidth>
+            </wp14:sizeRelH>
+            <wp14:sizeRelV relativeFrom="margin">
+              <wp14:pctHeight>0</wp14:pctHeight>
+            </wp14:sizeRelV>
           </wp:anchor>
         </w:drawing>
       </w:r>
@@ -4032,277 +4006,18 @@
           <w14:ligatures w14:val="none"/>
         </w:rPr>
         <w:drawing>
-          <wp:anchor distT="0" distB="0" distL="114300" distR="114300" simplePos="0" relativeHeight="251735552" behindDoc="0" locked="0" layoutInCell="1" allowOverlap="1" wp14:anchorId="19111EEC" wp14:editId="24201A13">
+          <wp:anchor distT="0" distB="0" distL="114300" distR="114300" simplePos="0" relativeHeight="251813376" behindDoc="0" locked="0" layoutInCell="1" allowOverlap="1" wp14:anchorId="55221A7F" wp14:editId="69958FB9">
             <wp:simplePos x="0" y="0"/>
-            <wp:positionH relativeFrom="column">
-              <wp:posOffset>3284499</wp:posOffset>
+            <wp:positionH relativeFrom="margin">
+              <wp:posOffset>3085465</wp:posOffset>
             </wp:positionH>
             <wp:positionV relativeFrom="paragraph">
-              <wp:posOffset>210820</wp:posOffset>
+              <wp:posOffset>170815</wp:posOffset>
             </wp:positionV>
-            <wp:extent cx="1779270" cy="412750"/>
-            <wp:effectExtent l="190500" t="190500" r="182880" b="196850"/>
+            <wp:extent cx="2599055" cy="474345"/>
+            <wp:effectExtent l="0" t="0" r="0" b="1905"/>
             <wp:wrapSquare wrapText="bothSides"/>
-            <wp:docPr id="3" name="Kép 3"/>
-            <wp:cNvGraphicFramePr>
-              <a:graphicFrameLocks xmlns:a="http://schemas.openxmlformats.org/drawingml/2006/main" noChangeAspect="1"/>
-            </wp:cNvGraphicFramePr>
-            <a:graphic xmlns:a="http://schemas.openxmlformats.org/drawingml/2006/main">
-              <a:graphicData uri="http://schemas.openxmlformats.org/drawingml/2006/picture">
-                <pic:pic xmlns:pic="http://schemas.openxmlformats.org/drawingml/2006/picture">
-                  <pic:nvPicPr>
-                    <pic:cNvPr id="1" name=""/>
-                    <pic:cNvPicPr/>
-                  </pic:nvPicPr>
-                  <pic:blipFill rotWithShape="1">
-                    <a:blip r:embed="rId17">
-                      <a:extLst>
-                        <a:ext uri="{28A0092B-C50C-407E-A947-70E740481C1C}">
-                          <a14:useLocalDpi xmlns:a14="http://schemas.microsoft.com/office/drawing/2010/main" val="0"/>
-                        </a:ext>
-                      </a:extLst>
-                    </a:blip>
-                    <a:srcRect l="29846" r="28868"/>
-                    <a:stretch>
-                      <a:fillRect/>
-                    </a:stretch>
-                  </pic:blipFill>
-                  <pic:spPr bwMode="auto">
-                    <a:xfrm>
-                      <a:off x="0" y="0"/>
-                      <a:ext cx="1779270" cy="412750"/>
-                    </a:xfrm>
-                    <a:prstGeom prst="rect">
-                      <a:avLst/>
-                    </a:prstGeom>
-                    <a:ln>
-                      <a:noFill/>
-                    </a:ln>
-                    <a:effectLst>
-                      <a:outerShdw blurRad="190500" algn="tl" rotWithShape="0">
-                        <a:srgbClr val="000000">
-                          <a:alpha val="70000"/>
-                        </a:srgbClr>
-                      </a:outerShdw>
-                    </a:effectLst>
-                    <a:extLst>
-                      <a:ext uri="{53640926-AAD7-44D8-BBD7-CCE9431645EC}">
-                        <a14:shadowObscured xmlns:a14="http://schemas.microsoft.com/office/drawing/2010/main"/>
-                      </a:ext>
-                    </a:extLst>
-                  </pic:spPr>
-                </pic:pic>
-              </a:graphicData>
-            </a:graphic>
-            <wp14:sizeRelH relativeFrom="margin">
-              <wp14:pctWidth>0</wp14:pctWidth>
-            </wp14:sizeRelH>
-            <wp14:sizeRelV relativeFrom="margin">
-              <wp14:pctHeight>0</wp14:pctHeight>
-            </wp14:sizeRelV>
-          </wp:anchor>
-        </w:drawing>
-      </w:r>
-      <w:r>
-        <w:rPr>
-          <w:rFonts w:ascii="Times New Roman" w:hAnsi="Times New Roman" w:cs="Times New Roman"/>
-          <w:noProof/>
-          <w:kern w:val="0"/>
-          <w:sz w:val="24"/>
-          <w:szCs w:val="24"/>
-          <w14:ligatures w14:val="none"/>
-        </w:rPr>
-        <w:drawing>
-          <wp:anchor distT="0" distB="0" distL="114300" distR="114300" simplePos="0" relativeHeight="251734528" behindDoc="0" locked="0" layoutInCell="1" allowOverlap="1" wp14:anchorId="2342C456" wp14:editId="51C6EE73">
-            <wp:simplePos x="0" y="0"/>
-            <wp:positionH relativeFrom="column">
-              <wp:posOffset>219075</wp:posOffset>
-            </wp:positionH>
-            <wp:positionV relativeFrom="paragraph">
-              <wp:posOffset>212039</wp:posOffset>
-            </wp:positionV>
-            <wp:extent cx="2123440" cy="412750"/>
-            <wp:effectExtent l="190500" t="190500" r="181610" b="196850"/>
-            <wp:wrapSquare wrapText="bothSides"/>
-            <wp:docPr id="2" name="Kép 2"/>
-            <wp:cNvGraphicFramePr>
-              <a:graphicFrameLocks xmlns:a="http://schemas.openxmlformats.org/drawingml/2006/main" noChangeAspect="1"/>
-            </wp:cNvGraphicFramePr>
-            <a:graphic xmlns:a="http://schemas.openxmlformats.org/drawingml/2006/main">
-              <a:graphicData uri="http://schemas.openxmlformats.org/drawingml/2006/picture">
-                <pic:pic xmlns:pic="http://schemas.openxmlformats.org/drawingml/2006/picture">
-                  <pic:nvPicPr>
-                    <pic:cNvPr id="1" name=""/>
-                    <pic:cNvPicPr/>
-                  </pic:nvPicPr>
-                  <pic:blipFill rotWithShape="1">
-                    <a:blip r:embed="rId18">
-                      <a:extLst>
-                        <a:ext uri="{28A0092B-C50C-407E-A947-70E740481C1C}">
-                          <a14:useLocalDpi xmlns:a14="http://schemas.microsoft.com/office/drawing/2010/main" val="0"/>
-                        </a:ext>
-                      </a:extLst>
-                    </a:blip>
-                    <a:srcRect l="26813" r="25915"/>
-                    <a:stretch>
-                      <a:fillRect/>
-                    </a:stretch>
-                  </pic:blipFill>
-                  <pic:spPr bwMode="auto">
-                    <a:xfrm>
-                      <a:off x="0" y="0"/>
-                      <a:ext cx="2123440" cy="412750"/>
-                    </a:xfrm>
-                    <a:prstGeom prst="rect">
-                      <a:avLst/>
-                    </a:prstGeom>
-                    <a:ln>
-                      <a:noFill/>
-                    </a:ln>
-                    <a:effectLst>
-                      <a:outerShdw blurRad="190500" algn="tl" rotWithShape="0">
-                        <a:srgbClr val="000000">
-                          <a:alpha val="70000"/>
-                        </a:srgbClr>
-                      </a:outerShdw>
-                    </a:effectLst>
-                    <a:extLst>
-                      <a:ext uri="{53640926-AAD7-44D8-BBD7-CCE9431645EC}">
-                        <a14:shadowObscured xmlns:a14="http://schemas.microsoft.com/office/drawing/2010/main"/>
-                      </a:ext>
-                    </a:extLst>
-                  </pic:spPr>
-                </pic:pic>
-              </a:graphicData>
-            </a:graphic>
-            <wp14:sizeRelH relativeFrom="margin">
-              <wp14:pctWidth>0</wp14:pctWidth>
-            </wp14:sizeRelH>
-            <wp14:sizeRelV relativeFrom="margin">
-              <wp14:pctHeight>0</wp14:pctHeight>
-            </wp14:sizeRelV>
-          </wp:anchor>
-        </w:drawing>
-      </w:r>
-    </w:p>
-    <w:p>
-      <w:pPr>
-        <w:rPr>
-          <w:rFonts w:ascii="Times New Roman" w:hAnsi="Times New Roman" w:cs="Times New Roman"/>
-          <w:noProof/>
-          <w:kern w:val="0"/>
-          <w:sz w:val="24"/>
-          <w:szCs w:val="24"/>
-          <w14:ligatures w14:val="none"/>
-        </w:rPr>
-      </w:pPr>
-    </w:p>
-    <w:p>
-      <w:pPr>
-        <w:rPr>
-          <w:rFonts w:ascii="Times New Roman" w:hAnsi="Times New Roman" w:cs="Times New Roman"/>
-          <w:sz w:val="36"/>
-          <w:szCs w:val="36"/>
-        </w:rPr>
-      </w:pPr>
-    </w:p>
-    <w:p>
-      <w:pPr>
-        <w:rPr>
-          <w:rFonts w:ascii="Times New Roman" w:hAnsi="Times New Roman" w:cs="Times New Roman"/>
-          <w:color w:val="70AD47" w:themeColor="accent6"/>
-          <w:sz w:val="26"/>
-          <w:szCs w:val="26"/>
-        </w:rPr>
-      </w:pPr>
-      <w:r>
-        <w:rPr>
-          <w:rFonts w:ascii="Times New Roman" w:hAnsi="Times New Roman" w:cs="Times New Roman"/>
-          <w:color w:val="70AD47" w:themeColor="accent6"/>
-          <w:sz w:val="26"/>
-          <w:szCs w:val="26"/>
-        </w:rPr>
-        <w:t>DE</w:t>
-      </w:r>
-    </w:p>
-    <w:p>
-      <w:pPr>
-        <w:spacing w:line="360" w:lineRule="auto"/>
-        <w:rPr>
-          <w:rFonts w:ascii="Times New Roman" w:hAnsi="Times New Roman" w:cs="Times New Roman"/>
-          <w:kern w:val="0"/>
-          <w:sz w:val="24"/>
-          <w:szCs w:val="24"/>
-          <w14:ligatures w14:val="none"/>
-        </w:rPr>
-      </w:pPr>
-      <w:r>
-        <w:rPr>
-          <w:rFonts w:ascii="Times New Roman" w:hAnsi="Times New Roman" w:cs="Times New Roman"/>
-          <w:kern w:val="0"/>
-          <w:sz w:val="24"/>
-          <w:szCs w:val="24"/>
-          <w14:ligatures w14:val="none"/>
-        </w:rPr>
-        <w:t xml:space="preserve">Az összes adat helyes megadása után az oldal egy 1,5 másodperces várakozási idő után átirányit a megfelelő oldalra. Ezt egy </w:t>
-      </w:r>
-      <w:r>
-        <w:rPr>
-          <w:rFonts w:ascii="Times New Roman" w:hAnsi="Times New Roman" w:cs="Times New Roman"/>
-          <w:b/>
-          <w:bCs/>
-          <w:kern w:val="0"/>
-          <w:sz w:val="24"/>
-          <w:szCs w:val="24"/>
-          <w14:ligatures w14:val="none"/>
-        </w:rPr>
-        <w:t>sikeres üzenet</w:t>
-      </w:r>
-      <w:r>
-        <w:rPr>
-          <w:rFonts w:ascii="Times New Roman" w:hAnsi="Times New Roman" w:cs="Times New Roman"/>
-          <w:kern w:val="0"/>
-          <w:sz w:val="24"/>
-          <w:szCs w:val="24"/>
-          <w14:ligatures w14:val="none"/>
-        </w:rPr>
-        <w:t xml:space="preserve"> is jelzi a felhasználó számára</w:t>
-      </w:r>
-    </w:p>
-    <w:p>
-      <w:pPr>
-        <w:spacing w:line="360" w:lineRule="auto"/>
-        <w:jc w:val="center"/>
-        <w:rPr>
-          <w:rFonts w:ascii="Times New Roman" w:hAnsi="Times New Roman" w:cs="Times New Roman"/>
-          <w:kern w:val="0"/>
-          <w:sz w:val="24"/>
-          <w:szCs w:val="24"/>
-          <w14:ligatures w14:val="none"/>
-        </w:rPr>
-      </w:pPr>
-      <w:r>
-        <w:rPr>
-          <w:rFonts w:ascii="Times New Roman" w:hAnsi="Times New Roman" w:cs="Times New Roman"/>
-          <w:noProof/>
-          <w:kern w:val="0"/>
-          <w:sz w:val="24"/>
-          <w:szCs w:val="24"/>
-          <w14:ligatures w14:val="none"/>
-        </w:rPr>
-        <w:drawing>
-          <wp:anchor distT="0" distB="0" distL="114300" distR="114300" simplePos="0" relativeHeight="251736576" behindDoc="0" locked="0" layoutInCell="1" allowOverlap="1" wp14:anchorId="5335DA92" wp14:editId="603211F0">
-            <wp:simplePos x="0" y="0"/>
-            <wp:positionH relativeFrom="column">
-              <wp:posOffset>1476883</wp:posOffset>
-            </wp:positionH>
-            <wp:positionV relativeFrom="paragraph">
-              <wp:posOffset>59055</wp:posOffset>
-            </wp:positionV>
-            <wp:extent cx="2581275" cy="357505"/>
-            <wp:effectExtent l="190500" t="190500" r="180975" b="194945"/>
-            <wp:wrapSquare wrapText="bothSides"/>
-            <wp:docPr id="5" name="Kép 5"/>
+            <wp:docPr id="47" name="Kép 47"/>
             <wp:cNvGraphicFramePr>
               <a:graphicFrameLocks xmlns:a="http://schemas.openxmlformats.org/drawingml/2006/main" noChangeAspect="1"/>
             </wp:cNvGraphicFramePr>
@@ -4314,7 +4029,7 @@
                     <pic:cNvPicPr/>
                   </pic:nvPicPr>
                   <pic:blipFill>
-                    <a:blip r:embed="rId19">
+                    <a:blip r:embed="rId17">
                       <a:extLst>
                         <a:ext uri="{28A0092B-C50C-407E-A947-70E740481C1C}">
                           <a14:useLocalDpi xmlns:a14="http://schemas.microsoft.com/office/drawing/2010/main" val="0"/>
@@ -4328,115 +4043,46 @@
                   <pic:spPr>
                     <a:xfrm>
                       <a:off x="0" y="0"/>
-                      <a:ext cx="2581275" cy="357505"/>
+                      <a:ext cx="2599055" cy="474345"/>
                     </a:xfrm>
                     <a:prstGeom prst="rect">
                       <a:avLst/>
                     </a:prstGeom>
-                    <a:ln>
-                      <a:noFill/>
-                    </a:ln>
-                    <a:effectLst>
-                      <a:outerShdw blurRad="190500" algn="tl" rotWithShape="0">
-                        <a:srgbClr val="000000">
-                          <a:alpha val="70000"/>
-                        </a:srgbClr>
-                      </a:outerShdw>
-                    </a:effectLst>
                   </pic:spPr>
                 </pic:pic>
               </a:graphicData>
             </a:graphic>
+            <wp14:sizeRelH relativeFrom="margin">
+              <wp14:pctWidth>0</wp14:pctWidth>
+            </wp14:sizeRelH>
+            <wp14:sizeRelV relativeFrom="margin">
+              <wp14:pctHeight>0</wp14:pctHeight>
+            </wp14:sizeRelV>
           </wp:anchor>
         </w:drawing>
       </w:r>
-    </w:p>
-    <w:p>
-      <w:pPr>
-        <w:spacing w:line="360" w:lineRule="auto"/>
-        <w:rPr>
-          <w:rFonts w:ascii="Times New Roman" w:hAnsi="Times New Roman" w:cs="Times New Roman"/>
-          <w:kern w:val="0"/>
-          <w:sz w:val="24"/>
-          <w:szCs w:val="24"/>
-          <w14:ligatures w14:val="none"/>
-        </w:rPr>
-      </w:pPr>
-    </w:p>
-    <w:p>
-      <w:pPr>
-        <w:spacing w:line="360" w:lineRule="auto"/>
-        <w:rPr>
-          <w:rFonts w:ascii="Times New Roman" w:hAnsi="Times New Roman" w:cs="Times New Roman"/>
-          <w:sz w:val="30"/>
-          <w:szCs w:val="30"/>
-          <w:u w:val="single"/>
-        </w:rPr>
-      </w:pPr>
-      <w:r>
-        <w:rPr>
-          <w:rFonts w:ascii="Times New Roman" w:hAnsi="Times New Roman" w:cs="Times New Roman"/>
-          <w:kern w:val="0"/>
-          <w:sz w:val="24"/>
-          <w:szCs w:val="24"/>
-          <w14:ligatures w14:val="none"/>
-        </w:rPr>
-        <w:t xml:space="preserve">Az oldal legelső megnyitásakor szükséges egy fiók létrehozása ezt a regisztrációs felületen lehetséges megtenni, amit a </w:t>
-      </w:r>
-      <w:r>
-        <w:rPr>
-          <w:rFonts w:ascii="Times New Roman" w:hAnsi="Times New Roman" w:cs="Times New Roman"/>
-          <w:b/>
-          <w:bCs/>
-          <w:kern w:val="0"/>
-          <w:sz w:val="24"/>
-          <w:szCs w:val="24"/>
-          <w14:ligatures w14:val="none"/>
-        </w:rPr>
-        <w:t>„Regisztrálj itt -&gt;”</w:t>
-      </w:r>
-      <w:r>
-        <w:rPr>
-          <w:rFonts w:ascii="Times New Roman" w:hAnsi="Times New Roman" w:cs="Times New Roman"/>
-          <w:kern w:val="0"/>
-          <w:sz w:val="24"/>
-          <w:szCs w:val="24"/>
-          <w14:ligatures w14:val="none"/>
-        </w:rPr>
-        <w:t xml:space="preserve"> linkre kattintva lehet elérni.</w:t>
-      </w:r>
-    </w:p>
-    <w:p>
-      <w:pPr>
-        <w:spacing w:line="360" w:lineRule="auto"/>
-        <w:jc w:val="center"/>
-        <w:rPr>
-          <w:rFonts w:ascii="Times New Roman" w:hAnsi="Times New Roman" w:cs="Times New Roman"/>
-          <w:sz w:val="30"/>
-          <w:szCs w:val="30"/>
-          <w:u w:val="single"/>
-        </w:rPr>
-      </w:pPr>
       <w:r>
         <w:rPr>
           <w:rFonts w:ascii="Times New Roman" w:hAnsi="Times New Roman" w:cs="Times New Roman"/>
           <w:noProof/>
-          <w:sz w:val="30"/>
-          <w:szCs w:val="30"/>
+          <w:kern w:val="0"/>
+          <w:sz w:val="24"/>
+          <w:szCs w:val="24"/>
+          <w14:ligatures w14:val="none"/>
         </w:rPr>
         <w:drawing>
-          <wp:anchor distT="0" distB="0" distL="114300" distR="114300" simplePos="0" relativeHeight="251737600" behindDoc="0" locked="0" layoutInCell="1" allowOverlap="1" wp14:anchorId="5D8AEF6C" wp14:editId="4FF02E66">
+          <wp:anchor distT="0" distB="0" distL="114300" distR="114300" simplePos="0" relativeHeight="251812352" behindDoc="0" locked="0" layoutInCell="1" allowOverlap="1" wp14:anchorId="24C08599" wp14:editId="25A1DB13">
             <wp:simplePos x="0" y="0"/>
-            <wp:positionH relativeFrom="column">
-              <wp:posOffset>1864944</wp:posOffset>
+            <wp:positionH relativeFrom="margin">
+              <wp:posOffset>66675</wp:posOffset>
             </wp:positionH>
             <wp:positionV relativeFrom="paragraph">
-              <wp:posOffset>38050</wp:posOffset>
+              <wp:posOffset>181610</wp:posOffset>
             </wp:positionV>
-            <wp:extent cx="1853565" cy="351790"/>
-            <wp:effectExtent l="190500" t="190500" r="184785" b="181610"/>
+            <wp:extent cx="2790825" cy="455295"/>
+            <wp:effectExtent l="0" t="0" r="9525" b="1905"/>
             <wp:wrapSquare wrapText="bothSides"/>
-            <wp:docPr id="1" name="Kép 1"/>
+            <wp:docPr id="45" name="Kép 45"/>
             <wp:cNvGraphicFramePr>
               <a:graphicFrameLocks xmlns:a="http://schemas.openxmlformats.org/drawingml/2006/main" noChangeAspect="1"/>
             </wp:cNvGraphicFramePr>
@@ -4448,7 +4094,7 @@
                     <pic:cNvPicPr/>
                   </pic:nvPicPr>
                   <pic:blipFill>
-                    <a:blip r:embed="rId20">
+                    <a:blip r:embed="rId18">
                       <a:extLst>
                         <a:ext uri="{28A0092B-C50C-407E-A947-70E740481C1C}">
                           <a14:useLocalDpi xmlns:a14="http://schemas.microsoft.com/office/drawing/2010/main" val="0"/>
@@ -4462,21 +4108,11 @@
                   <pic:spPr>
                     <a:xfrm>
                       <a:off x="0" y="0"/>
-                      <a:ext cx="1853565" cy="351790"/>
+                      <a:ext cx="2790825" cy="455295"/>
                     </a:xfrm>
                     <a:prstGeom prst="rect">
                       <a:avLst/>
                     </a:prstGeom>
-                    <a:ln>
-                      <a:noFill/>
-                    </a:ln>
-                    <a:effectLst>
-                      <a:outerShdw blurRad="190500" algn="tl" rotWithShape="0">
-                        <a:srgbClr val="000000">
-                          <a:alpha val="70000"/>
-                        </a:srgbClr>
-                      </a:outerShdw>
-                    </a:effectLst>
                   </pic:spPr>
                 </pic:pic>
               </a:graphicData>
@@ -4499,48 +4135,258 @@
           <w:szCs w:val="36"/>
         </w:rPr>
       </w:pPr>
-      <w:r>
+    </w:p>
+    <w:p>
+      <w:pPr>
+        <w:rPr>
+          <w:rFonts w:ascii="Times New Roman" w:hAnsi="Times New Roman" w:cs="Times New Roman"/>
+          <w:color w:val="70AD47" w:themeColor="accent6"/>
+          <w:sz w:val="26"/>
+          <w:szCs w:val="26"/>
+        </w:rPr>
+      </w:pPr>
+      <w:r>
+        <w:rPr>
+          <w:rFonts w:ascii="Times New Roman" w:hAnsi="Times New Roman" w:cs="Times New Roman"/>
+          <w:color w:val="70AD47" w:themeColor="accent6"/>
+          <w:sz w:val="26"/>
+          <w:szCs w:val="26"/>
+        </w:rPr>
+        <w:t>DE</w:t>
+      </w:r>
+    </w:p>
+    <w:p>
+      <w:pPr>
+        <w:spacing w:line="360" w:lineRule="auto"/>
+        <w:rPr>
+          <w:rFonts w:ascii="Times New Roman" w:hAnsi="Times New Roman" w:cs="Times New Roman"/>
+          <w:kern w:val="0"/>
+          <w:sz w:val="24"/>
+          <w:szCs w:val="24"/>
+          <w14:ligatures w14:val="none"/>
+        </w:rPr>
+      </w:pPr>
+      <w:r>
+        <w:rPr>
+          <w:rFonts w:ascii="Times New Roman" w:hAnsi="Times New Roman" w:cs="Times New Roman"/>
+          <w:kern w:val="0"/>
+          <w:sz w:val="24"/>
+          <w:szCs w:val="24"/>
+          <w14:ligatures w14:val="none"/>
+        </w:rPr>
+        <w:t xml:space="preserve">Az összes adat helyes megadása után az oldal egy 1,5 másodperces várakozási idő után átirányit a megfelelő oldalra. Ezt egy </w:t>
+      </w:r>
+      <w:r>
+        <w:rPr>
+          <w:rFonts w:ascii="Times New Roman" w:hAnsi="Times New Roman" w:cs="Times New Roman"/>
+          <w:b/>
+          <w:bCs/>
+          <w:kern w:val="0"/>
+          <w:sz w:val="24"/>
+          <w:szCs w:val="24"/>
+          <w14:ligatures w14:val="none"/>
+        </w:rPr>
+        <w:t>sikeres üzenet</w:t>
+      </w:r>
+      <w:r>
+        <w:rPr>
+          <w:rFonts w:ascii="Times New Roman" w:hAnsi="Times New Roman" w:cs="Times New Roman"/>
+          <w:kern w:val="0"/>
+          <w:sz w:val="24"/>
+          <w:szCs w:val="24"/>
+          <w14:ligatures w14:val="none"/>
+        </w:rPr>
+        <w:t xml:space="preserve"> is jelzi a felhasználó számára</w:t>
+      </w:r>
+    </w:p>
+    <w:p>
+      <w:pPr>
+        <w:spacing w:line="360" w:lineRule="auto"/>
+        <w:jc w:val="center"/>
+        <w:rPr>
+          <w:rFonts w:ascii="Times New Roman" w:hAnsi="Times New Roman" w:cs="Times New Roman"/>
+          <w:kern w:val="0"/>
+          <w:sz w:val="24"/>
+          <w:szCs w:val="24"/>
+          <w14:ligatures w14:val="none"/>
+        </w:rPr>
+      </w:pPr>
+      <w:r>
+        <w:rPr>
+          <w:rFonts w:ascii="Times New Roman" w:hAnsi="Times New Roman" w:cs="Times New Roman"/>
+          <w:noProof/>
+          <w:kern w:val="0"/>
+          <w:sz w:val="24"/>
+          <w:szCs w:val="24"/>
+          <w14:ligatures w14:val="none"/>
+        </w:rPr>
+        <w:drawing>
+          <wp:inline distT="0" distB="0" distL="0" distR="0" wp14:anchorId="05B346B2" wp14:editId="49ABC7B2">
+            <wp:extent cx="3181794" cy="552527"/>
+            <wp:effectExtent l="0" t="0" r="0" b="0"/>
+            <wp:docPr id="48" name="Kép 48"/>
+            <wp:cNvGraphicFramePr>
+              <a:graphicFrameLocks xmlns:a="http://schemas.openxmlformats.org/drawingml/2006/main" noChangeAspect="1"/>
+            </wp:cNvGraphicFramePr>
+            <a:graphic xmlns:a="http://schemas.openxmlformats.org/drawingml/2006/main">
+              <a:graphicData uri="http://schemas.openxmlformats.org/drawingml/2006/picture">
+                <pic:pic xmlns:pic="http://schemas.openxmlformats.org/drawingml/2006/picture">
+                  <pic:nvPicPr>
+                    <pic:cNvPr id="1" name=""/>
+                    <pic:cNvPicPr/>
+                  </pic:nvPicPr>
+                  <pic:blipFill>
+                    <a:blip r:embed="rId19"/>
+                    <a:stretch>
+                      <a:fillRect/>
+                    </a:stretch>
+                  </pic:blipFill>
+                  <pic:spPr>
+                    <a:xfrm>
+                      <a:off x="0" y="0"/>
+                      <a:ext cx="3181794" cy="552527"/>
+                    </a:xfrm>
+                    <a:prstGeom prst="rect">
+                      <a:avLst/>
+                    </a:prstGeom>
+                  </pic:spPr>
+                </pic:pic>
+              </a:graphicData>
+            </a:graphic>
+          </wp:inline>
+        </w:drawing>
+      </w:r>
+    </w:p>
+    <w:p>
+      <w:pPr>
+        <w:spacing w:line="360" w:lineRule="auto"/>
+        <w:rPr>
+          <w:rFonts w:ascii="Times New Roman" w:hAnsi="Times New Roman" w:cs="Times New Roman"/>
+          <w:sz w:val="30"/>
+          <w:szCs w:val="30"/>
+          <w:u w:val="single"/>
+        </w:rPr>
+      </w:pPr>
+      <w:r>
+        <w:rPr>
+          <w:rFonts w:ascii="Times New Roman" w:hAnsi="Times New Roman" w:cs="Times New Roman"/>
+          <w:kern w:val="0"/>
+          <w:sz w:val="24"/>
+          <w:szCs w:val="24"/>
+          <w14:ligatures w14:val="none"/>
+        </w:rPr>
+        <w:t xml:space="preserve">Az oldal legelső megnyitásakor szükséges egy fiók létrehozása ezt a regisztrációs felületen lehetséges megtenni, amit a </w:t>
+      </w:r>
+      <w:r>
+        <w:rPr>
+          <w:rFonts w:ascii="Times New Roman" w:hAnsi="Times New Roman" w:cs="Times New Roman"/>
+          <w:b/>
+          <w:bCs/>
+          <w:kern w:val="0"/>
+          <w:sz w:val="24"/>
+          <w:szCs w:val="24"/>
+          <w14:ligatures w14:val="none"/>
+        </w:rPr>
+        <w:t>„Regisztrálj itt -&gt;”</w:t>
+      </w:r>
+      <w:r>
+        <w:rPr>
+          <w:rFonts w:ascii="Times New Roman" w:hAnsi="Times New Roman" w:cs="Times New Roman"/>
+          <w:kern w:val="0"/>
+          <w:sz w:val="24"/>
+          <w:szCs w:val="24"/>
+          <w14:ligatures w14:val="none"/>
+        </w:rPr>
+        <w:t xml:space="preserve"> linkre kattintva lehet elérni.</w:t>
+      </w:r>
+    </w:p>
+    <w:p>
+      <w:pPr>
+        <w:spacing w:line="360" w:lineRule="auto"/>
+        <w:jc w:val="center"/>
+        <w:rPr>
+          <w:rFonts w:ascii="Times New Roman" w:hAnsi="Times New Roman" w:cs="Times New Roman"/>
+          <w:sz w:val="30"/>
+          <w:szCs w:val="30"/>
+          <w:u w:val="single"/>
+        </w:rPr>
+      </w:pPr>
+      <w:r>
+        <w:rPr>
+          <w:rFonts w:ascii="Times New Roman" w:hAnsi="Times New Roman" w:cs="Times New Roman"/>
+          <w:noProof/>
+          <w:sz w:val="30"/>
+          <w:szCs w:val="30"/>
+        </w:rPr>
+        <w:drawing>
+          <wp:inline distT="0" distB="0" distL="0" distR="0" wp14:anchorId="6655D5A6" wp14:editId="05F23D2A">
+            <wp:extent cx="2324424" cy="314369"/>
+            <wp:effectExtent l="0" t="0" r="0" b="9525"/>
+            <wp:docPr id="49" name="Kép 49"/>
+            <wp:cNvGraphicFramePr>
+              <a:graphicFrameLocks xmlns:a="http://schemas.openxmlformats.org/drawingml/2006/main" noChangeAspect="1"/>
+            </wp:cNvGraphicFramePr>
+            <a:graphic xmlns:a="http://schemas.openxmlformats.org/drawingml/2006/main">
+              <a:graphicData uri="http://schemas.openxmlformats.org/drawingml/2006/picture">
+                <pic:pic xmlns:pic="http://schemas.openxmlformats.org/drawingml/2006/picture">
+                  <pic:nvPicPr>
+                    <pic:cNvPr id="1" name=""/>
+                    <pic:cNvPicPr/>
+                  </pic:nvPicPr>
+                  <pic:blipFill>
+                    <a:blip r:embed="rId20"/>
+                    <a:stretch>
+                      <a:fillRect/>
+                    </a:stretch>
+                  </pic:blipFill>
+                  <pic:spPr>
+                    <a:xfrm>
+                      <a:off x="0" y="0"/>
+                      <a:ext cx="2324424" cy="314369"/>
+                    </a:xfrm>
+                    <a:prstGeom prst="rect">
+                      <a:avLst/>
+                    </a:prstGeom>
+                  </pic:spPr>
+                </pic:pic>
+              </a:graphicData>
+            </a:graphic>
+          </wp:inline>
+        </w:drawing>
+      </w:r>
+    </w:p>
+    <w:p>
+      <w:pPr>
         <w:rPr>
           <w:rFonts w:ascii="Times New Roman" w:hAnsi="Times New Roman" w:cs="Times New Roman"/>
           <w:sz w:val="36"/>
           <w:szCs w:val="36"/>
         </w:rPr>
-        <w:br w:type="page"/>
-      </w:r>
-      <w:r>
-        <w:rPr>
-          <w:rFonts w:ascii="Times New Roman" w:hAnsi="Times New Roman" w:cs="Times New Roman"/>
-          <w:color w:val="4472C4" w:themeColor="accent1"/>
+      </w:pPr>
+      <w:r>
+        <w:rPr>
+          <w:rFonts w:ascii="Times New Roman" w:hAnsi="Times New Roman" w:cs="Times New Roman"/>
           <w:sz w:val="36"/>
           <w:szCs w:val="36"/>
         </w:rPr>
-        <w:lastRenderedPageBreak/>
-        <w:t xml:space="preserve">2. </w:t>
-      </w:r>
-      <w:r>
-        <w:rPr>
-          <w:rFonts w:ascii="Times New Roman" w:hAnsi="Times New Roman" w:cs="Times New Roman"/>
-          <w:color w:val="4472C4" w:themeColor="accent1"/>
-          <w:sz w:val="36"/>
-          <w:szCs w:val="36"/>
-        </w:rPr>
-        <w:t>Navigáció</w:t>
+        <w:br w:type="page"/>
       </w:r>
       <w:r>
         <w:rPr>
           <w:noProof/>
           <w:color w:val="4472C4" w:themeColor="accent1"/>
         </w:rPr>
+        <w:lastRenderedPageBreak/>
         <mc:AlternateContent>
           <mc:Choice Requires="wps">
             <w:drawing>
-              <wp:anchor distT="0" distB="0" distL="114300" distR="114300" simplePos="0" relativeHeight="251705856" behindDoc="0" locked="0" layoutInCell="1" allowOverlap="1" wp14:anchorId="043227F0" wp14:editId="08F3DA4C">
+              <wp:anchor distT="0" distB="0" distL="114300" distR="114300" simplePos="0" relativeHeight="251705856" behindDoc="0" locked="0" layoutInCell="1" allowOverlap="1" wp14:anchorId="043227F0" wp14:editId="6B63D498">
                 <wp:simplePos x="0" y="0"/>
                 <wp:positionH relativeFrom="column">
-                  <wp:posOffset>-41275</wp:posOffset>
+                  <wp:posOffset>-107950</wp:posOffset>
                 </wp:positionH>
                 <wp:positionV relativeFrom="paragraph">
-                  <wp:posOffset>583565</wp:posOffset>
+                  <wp:posOffset>680720</wp:posOffset>
                 </wp:positionV>
                 <wp:extent cx="6012815" cy="635"/>
                 <wp:effectExtent l="0" t="0" r="0" b="0"/>
@@ -4611,7 +4457,7 @@
           </mc:Choice>
           <mc:Fallback>
             <w:pict>
-              <v:shape w14:anchorId="043227F0" id="_x0000_s1029" type="#_x0000_t202" style="position:absolute;margin-left:-3.25pt;margin-top:45.95pt;width:473.45pt;height:.05pt;z-index:251705856;visibility:visible;mso-wrap-style:square;mso-wrap-distance-left:9pt;mso-wrap-distance-top:0;mso-wrap-distance-right:9pt;mso-wrap-distance-bottom:0;mso-position-horizontal:absolute;mso-position-horizontal-relative:text;mso-position-vertical:absolute;mso-position-vertical-relative:text;v-text-anchor:top" o:gfxdata="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" stroked="f">
+              <v:shape w14:anchorId="043227F0" id="_x0000_s1029" type="#_x0000_t202" style="position:absolute;margin-left:-8.5pt;margin-top:53.6pt;width:473.45pt;height:.05pt;z-index:251705856;visibility:visible;mso-wrap-style:square;mso-wrap-distance-left:9pt;mso-wrap-distance-top:0;mso-wrap-distance-right:9pt;mso-wrap-distance-bottom:0;mso-position-horizontal:absolute;mso-position-horizontal-relative:text;mso-position-vertical:absolute;mso-position-vertical-relative:text;v-text-anchor:top" o:gfxdata="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" stroked="f">
                 <v:textbox style="mso-fit-shape-to-text:t" inset="0,0,0,0">
                   <w:txbxContent>
                     <w:p>
@@ -4657,10 +4503,18 @@
           <w:szCs w:val="36"/>
         </w:rPr>
         <w:drawing>
-          <wp:inline distT="0" distB="0" distL="0" distR="0" wp14:anchorId="0C9DDDF7" wp14:editId="0F98FB54">
-            <wp:extent cx="5760720" cy="278765"/>
-            <wp:effectExtent l="0" t="0" r="0" b="6985"/>
-            <wp:docPr id="13" name="Kép 13"/>
+          <wp:anchor distT="0" distB="0" distL="114300" distR="114300" simplePos="0" relativeHeight="251814400" behindDoc="0" locked="0" layoutInCell="1" allowOverlap="1" wp14:anchorId="0073E4BE" wp14:editId="61AC63DD">
+            <wp:simplePos x="0" y="0"/>
+            <wp:positionH relativeFrom="margin">
+              <wp:align>right</wp:align>
+            </wp:positionH>
+            <wp:positionV relativeFrom="paragraph">
+              <wp:posOffset>386080</wp:posOffset>
+            </wp:positionV>
+            <wp:extent cx="5760720" cy="297180"/>
+            <wp:effectExtent l="0" t="0" r="0" b="7620"/>
+            <wp:wrapSquare wrapText="bothSides"/>
+            <wp:docPr id="1" name="Kép 1"/>
             <wp:cNvGraphicFramePr>
               <a:graphicFrameLocks xmlns:a="http://schemas.openxmlformats.org/drawingml/2006/main" noChangeAspect="1"/>
             </wp:cNvGraphicFramePr>
@@ -4672,7 +4526,13 @@
                     <pic:cNvPicPr/>
                   </pic:nvPicPr>
                   <pic:blipFill>
-                    <a:blip r:embed="rId21"/>
+                    <a:blip r:embed="rId21" cstate="print">
+                      <a:extLst>
+                        <a:ext uri="{28A0092B-C50C-407E-A947-70E740481C1C}">
+                          <a14:useLocalDpi xmlns:a14="http://schemas.microsoft.com/office/drawing/2010/main" val="0"/>
+                        </a:ext>
+                      </a:extLst>
+                    </a:blip>
                     <a:stretch>
                       <a:fillRect/>
                     </a:stretch>
@@ -4680,7 +4540,7 @@
                   <pic:spPr>
                     <a:xfrm>
                       <a:off x="0" y="0"/>
-                      <a:ext cx="5760720" cy="278765"/>
+                      <a:ext cx="5760720" cy="297180"/>
                     </a:xfrm>
                     <a:prstGeom prst="rect">
                       <a:avLst/>
@@ -4689,9 +4549,27 @@
                 </pic:pic>
               </a:graphicData>
             </a:graphic>
-          </wp:inline>
+          </wp:anchor>
         </w:drawing>
       </w:r>
+      <w:r>
+        <w:rPr>
+          <w:rFonts w:ascii="Times New Roman" w:hAnsi="Times New Roman" w:cs="Times New Roman"/>
+          <w:color w:val="4472C4" w:themeColor="accent1"/>
+          <w:sz w:val="36"/>
+          <w:szCs w:val="36"/>
+        </w:rPr>
+        <w:t xml:space="preserve">2. </w:t>
+      </w:r>
+      <w:r>
+        <w:rPr>
+          <w:rFonts w:ascii="Times New Roman" w:hAnsi="Times New Roman" w:cs="Times New Roman"/>
+          <w:color w:val="4472C4" w:themeColor="accent1"/>
+          <w:sz w:val="36"/>
+          <w:szCs w:val="36"/>
+        </w:rPr>
+        <w:t>Navigáció</w:t>
+      </w:r>
     </w:p>
     <w:p>
       <w:pPr>
@@ -4724,7 +4602,23 @@
           <w:sz w:val="24"/>
           <w:szCs w:val="24"/>
         </w:rPr>
-        <w:t xml:space="preserve"> a felhasználó. Először itt találkozunk a navigációs sávval az oldal tetején. Bal sarokban egy logó látható, középen 4 gomb, amelyekkel a felhasználó navigálhat az oldalak közt, jobb szélen látható a büfé nyitvatartási ideje, valamint egy felhasználói ikon</w:t>
+        <w:t xml:space="preserve"> a felhasználó. Először itt találkozunk a navigációs sávval az oldal tetején. Bal sarokban egy logó látható, középen 4 gomb, amelyekkel a felhasználó navigálhat az oldalak közt, jobb szélen látható a büfé nyitvatartási idej</w:t>
+      </w:r>
+      <w:r>
+        <w:rPr>
+          <w:rFonts w:ascii="Times New Roman" w:hAnsi="Times New Roman" w:cs="Times New Roman"/>
+          <w:sz w:val="24"/>
+          <w:szCs w:val="24"/>
+        </w:rPr>
+        <w:t>ének megfelelő „Nyitva” vagy „Zárva” felirat</w:t>
+      </w:r>
+      <w:r>
+        <w:rPr>
+          <w:rFonts w:ascii="Times New Roman" w:hAnsi="Times New Roman" w:cs="Times New Roman"/>
+          <w:sz w:val="24"/>
+          <w:szCs w:val="24"/>
+        </w:rPr>
+        <w:t>, valamint egy felhasználói ikon</w:t>
       </w:r>
       <w:r>
         <w:rPr>
@@ -5158,7 +5052,6 @@
           <w:sz w:val="30"/>
           <w:szCs w:val="30"/>
         </w:rPr>
-        <w:lastRenderedPageBreak/>
         <w:drawing>
           <wp:anchor distT="0" distB="0" distL="114300" distR="114300" simplePos="0" relativeHeight="251801088" behindDoc="0" locked="0" layoutInCell="1" allowOverlap="1" wp14:anchorId="7104D21C" wp14:editId="2AE0B370">
             <wp:simplePos x="0" y="0"/>
@@ -5824,7 +5717,16 @@
           <w:sz w:val="24"/>
           <w:szCs w:val="24"/>
         </w:rPr>
-        <w:t>a büfésnek, aki elkezdheti összeállítani a rendelést. A felhasználó visszajelzést kap, ha sikeres a rendelés leadása, a kosár pedig kiürítésre kerül.</w:t>
+        <w:t xml:space="preserve">a büfésnek, aki elkezdheti összeállítani a rendelést. A felhasználó </w:t>
+      </w:r>
+      <w:r>
+        <w:rPr>
+          <w:rFonts w:ascii="Times New Roman" w:hAnsi="Times New Roman" w:cs="Times New Roman"/>
+          <w:sz w:val="24"/>
+          <w:szCs w:val="24"/>
+        </w:rPr>
+        <w:lastRenderedPageBreak/>
+        <w:t>visszajelzést kap, ha sikeres a rendelés leadása, a kosár pedig kiürítésre kerül.</w:t>
       </w:r>
       <w:r>
         <w:rPr>
@@ -5852,7 +5754,6 @@
           <w:sz w:val="30"/>
           <w:szCs w:val="30"/>
         </w:rPr>
-        <w:lastRenderedPageBreak/>
         <mc:AlternateContent>
           <mc:Choice Requires="wps">
             <w:drawing>
@@ -6205,13 +6106,13 @@
         <mc:AlternateContent>
           <mc:Choice Requires="wps">
             <w:drawing>
-              <wp:anchor distT="0" distB="0" distL="114300" distR="114300" simplePos="0" relativeHeight="251739648" behindDoc="0" locked="0" layoutInCell="1" allowOverlap="1" wp14:anchorId="6EDFD36A" wp14:editId="774B9179">
+              <wp:anchor distT="0" distB="0" distL="114300" distR="114300" simplePos="0" relativeHeight="251739648" behindDoc="0" locked="0" layoutInCell="1" allowOverlap="1" wp14:anchorId="6EDFD36A" wp14:editId="51384297">
                 <wp:simplePos x="0" y="0"/>
                 <wp:positionH relativeFrom="column">
-                  <wp:posOffset>28575</wp:posOffset>
+                  <wp:posOffset>76200</wp:posOffset>
                 </wp:positionH>
                 <wp:positionV relativeFrom="paragraph">
-                  <wp:posOffset>2150745</wp:posOffset>
+                  <wp:posOffset>1988820</wp:posOffset>
                 </wp:positionV>
                 <wp:extent cx="5932170" cy="635"/>
                 <wp:effectExtent l="0" t="0" r="0" b="0"/>
@@ -6275,11 +6176,7 @@
           </mc:Choice>
           <mc:Fallback>
             <w:pict>
-              <v:shapetype w14:anchorId="6EDFD36A" id="_x0000_t202" coordsize="21600,21600" o:spt="202" path="m,l,21600r21600,l21600,xe">
-                <v:stroke joinstyle="miter"/>
-                <v:path gradientshapeok="t" o:connecttype="rect"/>
-              </v:shapetype>
-              <v:shape id="_x0000_s1034" type="#_x0000_t202" style="position:absolute;margin-left:2.25pt;margin-top:169.35pt;width:467.1pt;height:.05pt;z-index:251739648;visibility:visible;mso-wrap-style:square;mso-wrap-distance-left:9pt;mso-wrap-distance-top:0;mso-wrap-distance-right:9pt;mso-wrap-distance-bottom:0;mso-position-horizontal:absolute;mso-position-horizontal-relative:text;mso-position-vertical:absolute;mso-position-vertical-relative:text;v-text-anchor:top" o:gfxdata="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" stroked="f">
+              <v:shape w14:anchorId="6EDFD36A" id="_x0000_s1034" type="#_x0000_t202" style="position:absolute;margin-left:6pt;margin-top:156.6pt;width:467.1pt;height:.05pt;z-index:251739648;visibility:visible;mso-wrap-style:square;mso-wrap-distance-left:9pt;mso-wrap-distance-top:0;mso-wrap-distance-right:9pt;mso-wrap-distance-bottom:0;mso-position-horizontal:absolute;mso-position-horizontal-relative:text;mso-position-vertical:absolute;mso-position-vertical-relative:text;v-text-anchor:top" o:gfxdata="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" stroked="f">
                 <v:textbox style="mso-fit-shape-to-text:t" inset="0,0,0,0">
                   <w:txbxContent>
                     <w:p>
@@ -7482,6 +7379,63 @@
       <w:r>
         <w:rPr>
           <w:rFonts w:ascii="Times New Roman" w:hAnsi="Times New Roman" w:cs="Times New Roman"/>
+          <w:noProof/>
+          <w:sz w:val="24"/>
+          <w:szCs w:val="24"/>
+        </w:rPr>
+        <w:drawing>
+          <wp:anchor distT="0" distB="0" distL="114300" distR="114300" simplePos="0" relativeHeight="251817472" behindDoc="0" locked="0" layoutInCell="1" allowOverlap="1" wp14:anchorId="3537A5A8" wp14:editId="249DADFC">
+            <wp:simplePos x="0" y="0"/>
+            <wp:positionH relativeFrom="margin">
+              <wp:align>left</wp:align>
+            </wp:positionH>
+            <wp:positionV relativeFrom="paragraph">
+              <wp:posOffset>13970</wp:posOffset>
+            </wp:positionV>
+            <wp:extent cx="2066925" cy="1616710"/>
+            <wp:effectExtent l="0" t="0" r="9525" b="2540"/>
+            <wp:wrapSquare wrapText="bothSides"/>
+            <wp:docPr id="46" name="Kép 46"/>
+            <wp:cNvGraphicFramePr>
+              <a:graphicFrameLocks xmlns:a="http://schemas.openxmlformats.org/drawingml/2006/main" noChangeAspect="1"/>
+            </wp:cNvGraphicFramePr>
+            <a:graphic xmlns:a="http://schemas.openxmlformats.org/drawingml/2006/main">
+              <a:graphicData uri="http://schemas.openxmlformats.org/drawingml/2006/picture">
+                <pic:pic xmlns:pic="http://schemas.openxmlformats.org/drawingml/2006/picture">
+                  <pic:nvPicPr>
+                    <pic:cNvPr id="1" name=""/>
+                    <pic:cNvPicPr/>
+                  </pic:nvPicPr>
+                  <pic:blipFill>
+                    <a:blip r:embed="rId29">
+                      <a:extLst>
+                        <a:ext uri="{28A0092B-C50C-407E-A947-70E740481C1C}">
+                          <a14:useLocalDpi xmlns:a14="http://schemas.microsoft.com/office/drawing/2010/main" val="0"/>
+                        </a:ext>
+                      </a:extLst>
+                    </a:blip>
+                    <a:stretch>
+                      <a:fillRect/>
+                    </a:stretch>
+                  </pic:blipFill>
+                  <pic:spPr>
+                    <a:xfrm>
+                      <a:off x="0" y="0"/>
+                      <a:ext cx="2066925" cy="1616710"/>
+                    </a:xfrm>
+                    <a:prstGeom prst="rect">
+                      <a:avLst/>
+                    </a:prstGeom>
+                  </pic:spPr>
+                </pic:pic>
+              </a:graphicData>
+            </a:graphic>
+          </wp:anchor>
+        </w:drawing>
+      </w:r>
+      <w:r>
+        <w:rPr>
+          <w:rFonts w:ascii="Times New Roman" w:hAnsi="Times New Roman" w:cs="Times New Roman"/>
           <w:sz w:val="24"/>
           <w:szCs w:val="24"/>
         </w:rPr>
@@ -7536,13 +7490,13 @@
         <mc:AlternateContent>
           <mc:Choice Requires="wps">
             <w:drawing>
-              <wp:anchor distT="0" distB="0" distL="114300" distR="114300" simplePos="0" relativeHeight="251708928" behindDoc="0" locked="0" layoutInCell="1" allowOverlap="1" wp14:anchorId="33FA4C5B" wp14:editId="6146B839">
+              <wp:anchor distT="0" distB="0" distL="114300" distR="114300" simplePos="0" relativeHeight="251708928" behindDoc="0" locked="0" layoutInCell="1" allowOverlap="1" wp14:anchorId="33FA4C5B" wp14:editId="2FB216DA">
                 <wp:simplePos x="0" y="0"/>
                 <wp:positionH relativeFrom="margin">
-                  <wp:posOffset>-142875</wp:posOffset>
+                  <wp:posOffset>-209550</wp:posOffset>
                 </wp:positionH>
                 <wp:positionV relativeFrom="paragraph">
-                  <wp:posOffset>1727835</wp:posOffset>
+                  <wp:posOffset>13335</wp:posOffset>
                 </wp:positionV>
                 <wp:extent cx="2562225" cy="476250"/>
                 <wp:effectExtent l="0" t="0" r="9525" b="0"/>
@@ -7610,7 +7564,7 @@
           </mc:Choice>
           <mc:Fallback>
             <w:pict>
-              <v:shape w14:anchorId="33FA4C5B" id="_x0000_s1037" type="#_x0000_t202" style="position:absolute;margin-left:-11.25pt;margin-top:136.05pt;width:201.75pt;height:37.5pt;z-index:251708928;visibility:visible;mso-wrap-style:square;mso-width-percent:0;mso-height-percent:0;mso-wrap-distance-left:9pt;mso-wrap-distance-top:0;mso-wrap-distance-right:9pt;mso-wrap-distance-bottom:0;mso-position-horizontal:absolute;mso-position-horizontal-relative:margin;mso-position-vertical:absolute;mso-position-vertical-relative:text;mso-width-percent:0;mso-height-percent:0;mso-width-relative:margin;mso-height-relative:margin;v-text-anchor:top" o:gfxdata="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" stroked="f">
+              <v:shape w14:anchorId="33FA4C5B" id="_x0000_s1037" type="#_x0000_t202" style="position:absolute;margin-left:-16.5pt;margin-top:1.05pt;width:201.75pt;height:37.5pt;z-index:251708928;visibility:visible;mso-wrap-style:square;mso-width-percent:0;mso-height-percent:0;mso-wrap-distance-left:9pt;mso-wrap-distance-top:0;mso-wrap-distance-right:9pt;mso-wrap-distance-bottom:0;mso-position-horizontal:absolute;mso-position-horizontal-relative:margin;mso-position-vertical:absolute;mso-position-vertical-relative:text;mso-width-percent:0;mso-height-percent:0;mso-width-relative:margin;mso-height-relative:margin;v-text-anchor:top" o:gfxdata="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" stroked="f">
                 <v:textbox inset="0,0,0,0">
                   <w:txbxContent>
                     <w:p>
@@ -7639,87 +7593,25 @@
           </mc:Fallback>
         </mc:AlternateContent>
       </w:r>
-      <w:r>
-        <w:rPr>
-          <w:rFonts w:ascii="Times New Roman" w:hAnsi="Times New Roman" w:cs="Times New Roman"/>
+    </w:p>
+    <w:p>
+      <w:pPr>
+        <w:spacing w:line="360" w:lineRule="auto"/>
+        <w:rPr>
+          <w:rFonts w:ascii="Times New Roman" w:hAnsi="Times New Roman" w:cs="Times New Roman"/>
+          <w:sz w:val="24"/>
+          <w:szCs w:val="24"/>
+        </w:rPr>
+      </w:pPr>
+      <w:r>
+        <w:rPr>
+          <w:rFonts w:ascii="Times New Roman" w:hAnsi="Times New Roman" w:cs="Times New Roman"/>
+          <w:noProof/>
           <w:sz w:val="24"/>
           <w:szCs w:val="24"/>
         </w:rPr>
         <w:drawing>
-          <wp:inline distT="0" distB="0" distL="0" distR="0" wp14:anchorId="3537A5A8" wp14:editId="07048D13">
-            <wp:extent cx="2066925" cy="1617302"/>
-            <wp:effectExtent l="0" t="0" r="0" b="2540"/>
-            <wp:docPr id="46" name="Kép 46"/>
-            <wp:cNvGraphicFramePr>
-              <a:graphicFrameLocks xmlns:a="http://schemas.openxmlformats.org/drawingml/2006/main" noChangeAspect="1"/>
-            </wp:cNvGraphicFramePr>
-            <a:graphic xmlns:a="http://schemas.openxmlformats.org/drawingml/2006/main">
-              <a:graphicData uri="http://schemas.openxmlformats.org/drawingml/2006/picture">
-                <pic:pic xmlns:pic="http://schemas.openxmlformats.org/drawingml/2006/picture">
-                  <pic:nvPicPr>
-                    <pic:cNvPr id="1" name=""/>
-                    <pic:cNvPicPr/>
-                  </pic:nvPicPr>
-                  <pic:blipFill>
-                    <a:blip r:embed="rId29"/>
-                    <a:stretch>
-                      <a:fillRect/>
-                    </a:stretch>
-                  </pic:blipFill>
-                  <pic:spPr>
-                    <a:xfrm>
-                      <a:off x="0" y="0"/>
-                      <a:ext cx="2070774" cy="1620314"/>
-                    </a:xfrm>
-                    <a:prstGeom prst="rect">
-                      <a:avLst/>
-                    </a:prstGeom>
-                  </pic:spPr>
-                </pic:pic>
-              </a:graphicData>
-            </a:graphic>
-          </wp:inline>
-        </w:drawing>
-      </w:r>
-    </w:p>
-    <w:p>
-      <w:pPr>
-        <w:spacing w:line="360" w:lineRule="auto"/>
-        <w:rPr>
-          <w:rFonts w:ascii="Times New Roman" w:hAnsi="Times New Roman" w:cs="Times New Roman"/>
-          <w:sz w:val="24"/>
-          <w:szCs w:val="24"/>
-        </w:rPr>
-      </w:pPr>
-    </w:p>
-    <w:p>
-      <w:pPr>
-        <w:spacing w:line="360" w:lineRule="auto"/>
-        <w:rPr>
-          <w:rFonts w:ascii="Times New Roman" w:hAnsi="Times New Roman" w:cs="Times New Roman"/>
-          <w:sz w:val="24"/>
-          <w:szCs w:val="24"/>
-        </w:rPr>
-      </w:pPr>
-    </w:p>
-    <w:p>
-      <w:pPr>
-        <w:spacing w:line="360" w:lineRule="auto"/>
-        <w:rPr>
-          <w:rFonts w:ascii="Times New Roman" w:hAnsi="Times New Roman" w:cs="Times New Roman"/>
-          <w:sz w:val="24"/>
-          <w:szCs w:val="24"/>
-        </w:rPr>
-      </w:pPr>
-      <w:r>
-        <w:rPr>
-          <w:rFonts w:ascii="Times New Roman" w:hAnsi="Times New Roman" w:cs="Times New Roman"/>
-          <w:noProof/>
-          <w:sz w:val="24"/>
-          <w:szCs w:val="24"/>
-        </w:rPr>
-        <w:drawing>
-          <wp:anchor distT="0" distB="0" distL="114300" distR="114300" simplePos="0" relativeHeight="251709952" behindDoc="0" locked="0" layoutInCell="1" allowOverlap="1" wp14:anchorId="44B638A0" wp14:editId="13B3C5CB">
+          <wp:anchor distT="0" distB="0" distL="114300" distR="114300" simplePos="0" relativeHeight="251709952" behindDoc="0" locked="0" layoutInCell="1" allowOverlap="1" wp14:anchorId="44B638A0" wp14:editId="13CB1707">
             <wp:simplePos x="0" y="0"/>
             <wp:positionH relativeFrom="column">
               <wp:posOffset>-7620</wp:posOffset>
@@ -7802,7 +7694,7 @@
         <mc:AlternateContent>
           <mc:Choice Requires="wps">
             <w:drawing>
-              <wp:anchor distT="0" distB="0" distL="114300" distR="114300" simplePos="0" relativeHeight="251712000" behindDoc="0" locked="0" layoutInCell="1" allowOverlap="1" wp14:anchorId="39C44144" wp14:editId="7C2404A2">
+              <wp:anchor distT="0" distB="0" distL="114300" distR="114300" simplePos="0" relativeHeight="251712000" behindDoc="0" locked="0" layoutInCell="1" allowOverlap="1" wp14:anchorId="39C44144" wp14:editId="41074100">
                 <wp:simplePos x="0" y="0"/>
                 <wp:positionH relativeFrom="column">
                   <wp:posOffset>21259</wp:posOffset>
@@ -7904,21 +7796,605 @@
       </w:r>
       <w:r>
         <w:rPr>
+          <w:rFonts w:ascii="Times New Roman" w:hAnsi="Times New Roman" w:cs="Times New Roman"/>
+          <w:sz w:val="24"/>
+          <w:szCs w:val="24"/>
+        </w:rPr>
+        <w:t>A „Profil beállítások” gombra kattintva megjelenő felületek a képen látható menü fogadja a felhasználót. Profiljának négy tulajdonságát módosíthatja.</w:t>
+      </w:r>
+      <w:r>
+        <w:rPr>
+          <w:noProof/>
+        </w:rPr>
+        <w:t xml:space="preserve"> </w:t>
+      </w:r>
+      <w:r>
+        <w:rPr>
+          <w:rFonts w:ascii="Times New Roman" w:hAnsi="Times New Roman" w:cs="Times New Roman"/>
+          <w:noProof/>
+          <w:sz w:val="24"/>
+          <w:szCs w:val="24"/>
+        </w:rPr>
+        <w:t>Ezekre a gombokra kattintva négy különböző űrlap jelenik meg, amelyben megadva friss adatait a „Mentés” gombra kattintva elmentheti a feelhasználó, legközelebbi bejelentkezés alkalmával már ezeket használhatja.</w:t>
+      </w:r>
+      <w:r>
+        <w:rPr>
+          <w:rFonts w:ascii="Times New Roman" w:hAnsi="Times New Roman" w:cs="Times New Roman"/>
+          <w:noProof/>
+          <w:sz w:val="24"/>
+          <w:szCs w:val="24"/>
+        </w:rPr>
+        <w:t xml:space="preserve"> Ha a fiók jelszavát szeretné módosítani, előbb meg kell adni a régi jelszót, ha ez hibás, nem lehet</w:t>
+      </w:r>
+      <w:r>
+        <w:rPr>
+          <w:rFonts w:ascii="Times New Roman" w:hAnsi="Times New Roman" w:cs="Times New Roman"/>
+          <w:noProof/>
+          <w:sz w:val="24"/>
+          <w:szCs w:val="24"/>
+        </w:rPr>
+        <w:t xml:space="preserve"> </w:t>
+      </w:r>
+      <w:r>
+        <w:rPr>
+          <w:rFonts w:ascii="Times New Roman" w:hAnsi="Times New Roman" w:cs="Times New Roman"/>
+          <w:noProof/>
+          <w:sz w:val="24"/>
+          <w:szCs w:val="24"/>
+        </w:rPr>
+        <w:t>módosítani.</w:t>
+      </w:r>
+    </w:p>
+    <w:p>
+      <w:pPr>
+        <w:spacing w:line="360" w:lineRule="auto"/>
+        <w:rPr>
+          <w:rFonts w:ascii="Times New Roman" w:hAnsi="Times New Roman" w:cs="Times New Roman"/>
+          <w:noProof/>
+          <w:sz w:val="24"/>
+          <w:szCs w:val="24"/>
+        </w:rPr>
+      </w:pPr>
+    </w:p>
+    <w:p>
+      <w:pPr>
+        <w:spacing w:line="360" w:lineRule="auto"/>
+        <w:rPr>
+          <w:rFonts w:ascii="Times New Roman" w:hAnsi="Times New Roman" w:cs="Times New Roman"/>
+          <w:noProof/>
+          <w:sz w:val="24"/>
+          <w:szCs w:val="24"/>
+        </w:rPr>
+      </w:pPr>
+    </w:p>
+    <w:p>
+      <w:pPr>
+        <w:rPr>
+          <w:rFonts w:ascii="Times New Roman" w:hAnsi="Times New Roman" w:cs="Times New Roman"/>
+          <w:noProof/>
+          <w:sz w:val="24"/>
+          <w:szCs w:val="24"/>
+        </w:rPr>
+      </w:pPr>
+      <w:r>
+        <w:rPr>
+          <w:rFonts w:ascii="Times New Roman" w:hAnsi="Times New Roman" w:cs="Times New Roman"/>
+          <w:noProof/>
+          <w:sz w:val="24"/>
+          <w:szCs w:val="24"/>
+        </w:rPr>
+        <w:drawing>
+          <wp:anchor distT="0" distB="0" distL="114300" distR="114300" simplePos="0" relativeHeight="251819520" behindDoc="0" locked="0" layoutInCell="1" allowOverlap="1" wp14:anchorId="793EB15C" wp14:editId="33289647">
+            <wp:simplePos x="0" y="0"/>
+            <wp:positionH relativeFrom="page">
+              <wp:posOffset>5720080</wp:posOffset>
+            </wp:positionH>
+            <wp:positionV relativeFrom="paragraph">
+              <wp:posOffset>98425</wp:posOffset>
+            </wp:positionV>
+            <wp:extent cx="1511300" cy="1170305"/>
+            <wp:effectExtent l="0" t="0" r="0" b="0"/>
+            <wp:wrapSquare wrapText="bothSides"/>
+            <wp:docPr id="53" name="Kép 53"/>
+            <wp:cNvGraphicFramePr>
+              <a:graphicFrameLocks xmlns:a="http://schemas.openxmlformats.org/drawingml/2006/main" noChangeAspect="1"/>
+            </wp:cNvGraphicFramePr>
+            <a:graphic xmlns:a="http://schemas.openxmlformats.org/drawingml/2006/main">
+              <a:graphicData uri="http://schemas.openxmlformats.org/drawingml/2006/picture">
+                <pic:pic xmlns:pic="http://schemas.openxmlformats.org/drawingml/2006/picture">
+                  <pic:nvPicPr>
+                    <pic:cNvPr id="1" name=""/>
+                    <pic:cNvPicPr/>
+                  </pic:nvPicPr>
+                  <pic:blipFill>
+                    <a:blip r:embed="rId31" cstate="print">
+                      <a:extLst>
+                        <a:ext uri="{28A0092B-C50C-407E-A947-70E740481C1C}">
+                          <a14:useLocalDpi xmlns:a14="http://schemas.microsoft.com/office/drawing/2010/main" val="0"/>
+                        </a:ext>
+                      </a:extLst>
+                    </a:blip>
+                    <a:stretch>
+                      <a:fillRect/>
+                    </a:stretch>
+                  </pic:blipFill>
+                  <pic:spPr>
+                    <a:xfrm>
+                      <a:off x="0" y="0"/>
+                      <a:ext cx="1511300" cy="1170305"/>
+                    </a:xfrm>
+                    <a:prstGeom prst="rect">
+                      <a:avLst/>
+                    </a:prstGeom>
+                  </pic:spPr>
+                </pic:pic>
+              </a:graphicData>
+            </a:graphic>
+            <wp14:sizeRelH relativeFrom="margin">
+              <wp14:pctWidth>0</wp14:pctWidth>
+            </wp14:sizeRelH>
+            <wp14:sizeRelV relativeFrom="margin">
+              <wp14:pctHeight>0</wp14:pctHeight>
+            </wp14:sizeRelV>
+          </wp:anchor>
+        </w:drawing>
+      </w:r>
+      <w:r>
+        <w:rPr>
+          <w:rFonts w:ascii="Times New Roman" w:hAnsi="Times New Roman" w:cs="Times New Roman"/>
+          <w:noProof/>
+          <w:sz w:val="24"/>
+          <w:szCs w:val="24"/>
+        </w:rPr>
+        <w:drawing>
+          <wp:anchor distT="0" distB="0" distL="114300" distR="114300" simplePos="0" relativeHeight="251818496" behindDoc="0" locked="0" layoutInCell="1" allowOverlap="1" wp14:anchorId="1AFEA4E0" wp14:editId="36EFC416">
+            <wp:simplePos x="0" y="0"/>
+            <wp:positionH relativeFrom="column">
+              <wp:posOffset>3148330</wp:posOffset>
+            </wp:positionH>
+            <wp:positionV relativeFrom="paragraph">
+              <wp:posOffset>229870</wp:posOffset>
+            </wp:positionV>
+            <wp:extent cx="1631950" cy="971550"/>
+            <wp:effectExtent l="0" t="0" r="6350" b="0"/>
+            <wp:wrapSquare wrapText="bothSides"/>
+            <wp:docPr id="52" name="Kép 52"/>
+            <wp:cNvGraphicFramePr>
+              <a:graphicFrameLocks xmlns:a="http://schemas.openxmlformats.org/drawingml/2006/main" noChangeAspect="1"/>
+            </wp:cNvGraphicFramePr>
+            <a:graphic xmlns:a="http://schemas.openxmlformats.org/drawingml/2006/main">
+              <a:graphicData uri="http://schemas.openxmlformats.org/drawingml/2006/picture">
+                <pic:pic xmlns:pic="http://schemas.openxmlformats.org/drawingml/2006/picture">
+                  <pic:nvPicPr>
+                    <pic:cNvPr id="1" name=""/>
+                    <pic:cNvPicPr/>
+                  </pic:nvPicPr>
+                  <pic:blipFill>
+                    <a:blip r:embed="rId32" cstate="print">
+                      <a:extLst>
+                        <a:ext uri="{28A0092B-C50C-407E-A947-70E740481C1C}">
+                          <a14:useLocalDpi xmlns:a14="http://schemas.microsoft.com/office/drawing/2010/main" val="0"/>
+                        </a:ext>
+                      </a:extLst>
+                    </a:blip>
+                    <a:stretch>
+                      <a:fillRect/>
+                    </a:stretch>
+                  </pic:blipFill>
+                  <pic:spPr>
+                    <a:xfrm>
+                      <a:off x="0" y="0"/>
+                      <a:ext cx="1631950" cy="971550"/>
+                    </a:xfrm>
+                    <a:prstGeom prst="rect">
+                      <a:avLst/>
+                    </a:prstGeom>
+                  </pic:spPr>
+                </pic:pic>
+              </a:graphicData>
+            </a:graphic>
+            <wp14:sizeRelH relativeFrom="margin">
+              <wp14:pctWidth>0</wp14:pctWidth>
+            </wp14:sizeRelH>
+            <wp14:sizeRelV relativeFrom="margin">
+              <wp14:pctHeight>0</wp14:pctHeight>
+            </wp14:sizeRelV>
+          </wp:anchor>
+        </w:drawing>
+      </w:r>
+      <w:r>
+        <w:rPr>
+          <w:rFonts w:ascii="Times New Roman" w:hAnsi="Times New Roman" w:cs="Times New Roman"/>
+          <w:noProof/>
+          <w:sz w:val="24"/>
+          <w:szCs w:val="24"/>
+        </w:rPr>
+        <w:drawing>
+          <wp:anchor distT="0" distB="0" distL="114300" distR="114300" simplePos="0" relativeHeight="251815424" behindDoc="0" locked="0" layoutInCell="1" allowOverlap="1" wp14:anchorId="69A848F2" wp14:editId="20D4CC56">
+            <wp:simplePos x="0" y="0"/>
+            <wp:positionH relativeFrom="margin">
+              <wp:posOffset>-276225</wp:posOffset>
+            </wp:positionH>
+            <wp:positionV relativeFrom="paragraph">
+              <wp:posOffset>239395</wp:posOffset>
+            </wp:positionV>
+            <wp:extent cx="1668780" cy="981710"/>
+            <wp:effectExtent l="0" t="0" r="7620" b="8890"/>
+            <wp:wrapSquare wrapText="bothSides"/>
+            <wp:docPr id="50" name="Kép 50"/>
+            <wp:cNvGraphicFramePr>
+              <a:graphicFrameLocks xmlns:a="http://schemas.openxmlformats.org/drawingml/2006/main" noChangeAspect="1"/>
+            </wp:cNvGraphicFramePr>
+            <a:graphic xmlns:a="http://schemas.openxmlformats.org/drawingml/2006/main">
+              <a:graphicData uri="http://schemas.openxmlformats.org/drawingml/2006/picture">
+                <pic:pic xmlns:pic="http://schemas.openxmlformats.org/drawingml/2006/picture">
+                  <pic:nvPicPr>
+                    <pic:cNvPr id="0" name="Picture 2"/>
+                    <pic:cNvPicPr>
+                      <a:picLocks noChangeAspect="1" noChangeArrowheads="1"/>
+                    </pic:cNvPicPr>
+                  </pic:nvPicPr>
+                  <pic:blipFill>
+                    <a:blip r:embed="rId33" cstate="print">
+                      <a:extLst>
+                        <a:ext uri="{28A0092B-C50C-407E-A947-70E740481C1C}">
+                          <a14:useLocalDpi xmlns:a14="http://schemas.microsoft.com/office/drawing/2010/main" val="0"/>
+                        </a:ext>
+                      </a:extLst>
+                    </a:blip>
+                    <a:srcRect/>
+                    <a:stretch>
+                      <a:fillRect/>
+                    </a:stretch>
+                  </pic:blipFill>
+                  <pic:spPr bwMode="auto">
+                    <a:xfrm>
+                      <a:off x="0" y="0"/>
+                      <a:ext cx="1668780" cy="981710"/>
+                    </a:xfrm>
+                    <a:prstGeom prst="rect">
+                      <a:avLst/>
+                    </a:prstGeom>
+                    <a:noFill/>
+                  </pic:spPr>
+                </pic:pic>
+              </a:graphicData>
+            </a:graphic>
+            <wp14:sizeRelH relativeFrom="margin">
+              <wp14:pctWidth>0</wp14:pctWidth>
+            </wp14:sizeRelH>
+            <wp14:sizeRelV relativeFrom="margin">
+              <wp14:pctHeight>0</wp14:pctHeight>
+            </wp14:sizeRelV>
+          </wp:anchor>
+        </w:drawing>
+      </w:r>
+      <w:r>
+        <w:rPr>
+          <w:rFonts w:ascii="Times New Roman" w:hAnsi="Times New Roman" w:cs="Times New Roman"/>
+          <w:noProof/>
+          <w:sz w:val="24"/>
+          <w:szCs w:val="24"/>
+        </w:rPr>
+        <w:drawing>
+          <wp:anchor distT="0" distB="0" distL="114300" distR="114300" simplePos="0" relativeHeight="251816448" behindDoc="0" locked="0" layoutInCell="1" allowOverlap="1" wp14:anchorId="68FAFC6A" wp14:editId="0402C7D9">
+            <wp:simplePos x="0" y="0"/>
+            <wp:positionH relativeFrom="margin">
+              <wp:posOffset>1426845</wp:posOffset>
+            </wp:positionH>
+            <wp:positionV relativeFrom="paragraph">
+              <wp:posOffset>230505</wp:posOffset>
+            </wp:positionV>
+            <wp:extent cx="1670050" cy="981075"/>
+            <wp:effectExtent l="0" t="0" r="6350" b="9525"/>
+            <wp:wrapSquare wrapText="bothSides"/>
+            <wp:docPr id="51" name="Kép 51"/>
+            <wp:cNvGraphicFramePr>
+              <a:graphicFrameLocks xmlns:a="http://schemas.openxmlformats.org/drawingml/2006/main" noChangeAspect="1"/>
+            </wp:cNvGraphicFramePr>
+            <a:graphic xmlns:a="http://schemas.openxmlformats.org/drawingml/2006/main">
+              <a:graphicData uri="http://schemas.openxmlformats.org/drawingml/2006/picture">
+                <pic:pic xmlns:pic="http://schemas.openxmlformats.org/drawingml/2006/picture">
+                  <pic:nvPicPr>
+                    <pic:cNvPr id="1" name=""/>
+                    <pic:cNvPicPr/>
+                  </pic:nvPicPr>
+                  <pic:blipFill>
+                    <a:blip r:embed="rId34" cstate="print">
+                      <a:extLst>
+                        <a:ext uri="{28A0092B-C50C-407E-A947-70E740481C1C}">
+                          <a14:useLocalDpi xmlns:a14="http://schemas.microsoft.com/office/drawing/2010/main" val="0"/>
+                        </a:ext>
+                      </a:extLst>
+                    </a:blip>
+                    <a:stretch>
+                      <a:fillRect/>
+                    </a:stretch>
+                  </pic:blipFill>
+                  <pic:spPr>
+                    <a:xfrm>
+                      <a:off x="0" y="0"/>
+                      <a:ext cx="1670050" cy="981075"/>
+                    </a:xfrm>
+                    <a:prstGeom prst="rect">
+                      <a:avLst/>
+                    </a:prstGeom>
+                  </pic:spPr>
+                </pic:pic>
+              </a:graphicData>
+            </a:graphic>
+            <wp14:sizeRelH relativeFrom="margin">
+              <wp14:pctWidth>0</wp14:pctWidth>
+            </wp14:sizeRelH>
+            <wp14:sizeRelV relativeFrom="margin">
+              <wp14:pctHeight>0</wp14:pctHeight>
+            </wp14:sizeRelV>
+          </wp:anchor>
+        </w:drawing>
+      </w:r>
+      <w:r>
+        <w:rPr>
           <w:noProof/>
         </w:rPr>
         <mc:AlternateContent>
           <mc:Choice Requires="wps">
             <w:drawing>
-              <wp:anchor distT="0" distB="0" distL="114300" distR="114300" simplePos="0" relativeHeight="251720192" behindDoc="0" locked="0" layoutInCell="1" allowOverlap="1" wp14:anchorId="44181876" wp14:editId="3F6389A3">
+              <wp:anchor distT="0" distB="0" distL="114300" distR="114300" simplePos="0" relativeHeight="251724288" behindDoc="0" locked="0" layoutInCell="1" allowOverlap="1" wp14:anchorId="0B662D61" wp14:editId="7B3F5DEA">
                 <wp:simplePos x="0" y="0"/>
                 <wp:positionH relativeFrom="column">
-                  <wp:posOffset>1415415</wp:posOffset>
+                  <wp:posOffset>4843780</wp:posOffset>
                 </wp:positionH>
                 <wp:positionV relativeFrom="paragraph">
-                  <wp:posOffset>3927475</wp:posOffset>
+                  <wp:posOffset>1296670</wp:posOffset>
                 </wp:positionV>
-                <wp:extent cx="1614805" cy="635"/>
-                <wp:effectExtent l="0" t="0" r="4445" b="0"/>
+                <wp:extent cx="1466215" cy="200025"/>
+                <wp:effectExtent l="0" t="0" r="635" b="9525"/>
+                <wp:wrapSquare wrapText="bothSides"/>
+                <wp:docPr id="1752795455" name="Szövegdoboz 1"/>
+                <wp:cNvGraphicFramePr/>
+                <a:graphic xmlns:a="http://schemas.openxmlformats.org/drawingml/2006/main">
+                  <a:graphicData uri="http://schemas.microsoft.com/office/word/2010/wordprocessingShape">
+                    <wps:wsp>
+                      <wps:cNvSpPr txBox="1"/>
+                      <wps:spPr>
+                        <a:xfrm>
+                          <a:off x="0" y="0"/>
+                          <a:ext cx="1466215" cy="200025"/>
+                        </a:xfrm>
+                        <a:prstGeom prst="rect">
+                          <a:avLst/>
+                        </a:prstGeom>
+                        <a:solidFill>
+                          <a:prstClr val="white"/>
+                        </a:solidFill>
+                        <a:ln>
+                          <a:noFill/>
+                        </a:ln>
+                      </wps:spPr>
+                      <wps:txbx>
+                        <w:txbxContent>
+                          <w:p>
+                            <w:pPr>
+                              <w:pStyle w:val="Kpalrs"/>
+                              <w:jc w:val="center"/>
+                              <w:rPr>
+                                <w:noProof/>
+                                <w:sz w:val="22"/>
+                                <w:szCs w:val="22"/>
+                              </w:rPr>
+                            </w:pPr>
+                            <w:r>
+                              <w:rPr>
+                                <w:noProof/>
+                              </w:rPr>
+                              <w:t>1</w:t>
+                            </w:r>
+                            <w:r>
+                              <w:rPr>
+                                <w:noProof/>
+                              </w:rPr>
+                              <w:t>6</w:t>
+                            </w:r>
+                            <w:r>
+                              <w:t>. ábra: Jelszó módosítása</w:t>
+                            </w:r>
+                          </w:p>
+                        </w:txbxContent>
+                      </wps:txbx>
+                      <wps:bodyPr rot="0" spcFirstLastPara="0" vertOverflow="overflow" horzOverflow="overflow" vert="horz" wrap="square" lIns="0" tIns="0" rIns="0" bIns="0" numCol="1" spcCol="0" rtlCol="0" fromWordArt="0" anchor="t" anchorCtr="0" forceAA="0" compatLnSpc="1">
+                        <a:prstTxWarp prst="textNoShape">
+                          <a:avLst/>
+                        </a:prstTxWarp>
+                        <a:noAutofit/>
+                      </wps:bodyPr>
+                    </wps:wsp>
+                  </a:graphicData>
+                </a:graphic>
+                <wp14:sizeRelV relativeFrom="margin">
+                  <wp14:pctHeight>0</wp14:pctHeight>
+                </wp14:sizeRelV>
+              </wp:anchor>
+            </w:drawing>
+          </mc:Choice>
+          <mc:Fallback>
+            <w:pict>
+              <v:shape w14:anchorId="0B662D61" id="_x0000_s1039" type="#_x0000_t202" style="position:absolute;margin-left:381.4pt;margin-top:102.1pt;width:115.45pt;height:15.75pt;z-index:251724288;visibility:visible;mso-wrap-style:square;mso-height-percent:0;mso-wrap-distance-left:9pt;mso-wrap-distance-top:0;mso-wrap-distance-right:9pt;mso-wrap-distance-bottom:0;mso-position-horizontal:absolute;mso-position-horizontal-relative:text;mso-position-vertical:absolute;mso-position-vertical-relative:text;mso-height-percent:0;mso-height-relative:margin;v-text-anchor:top" o:gfxdata="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" stroked="f">
+                <v:textbox inset="0,0,0,0">
+                  <w:txbxContent>
+                    <w:p>
+                      <w:pPr>
+                        <w:pStyle w:val="Kpalrs"/>
+                        <w:jc w:val="center"/>
+                        <w:rPr>
+                          <w:noProof/>
+                          <w:sz w:val="22"/>
+                          <w:szCs w:val="22"/>
+                        </w:rPr>
+                      </w:pPr>
+                      <w:r>
+                        <w:rPr>
+                          <w:noProof/>
+                        </w:rPr>
+                        <w:t>1</w:t>
+                      </w:r>
+                      <w:r>
+                        <w:rPr>
+                          <w:noProof/>
+                        </w:rPr>
+                        <w:t>6</w:t>
+                      </w:r>
+                      <w:r>
+                        <w:t>. ábra: Jelszó módosítása</w:t>
+                      </w:r>
+                    </w:p>
+                  </w:txbxContent>
+                </v:textbox>
+                <w10:wrap type="square"/>
+              </v:shape>
+            </w:pict>
+          </mc:Fallback>
+        </mc:AlternateContent>
+      </w:r>
+      <w:r>
+        <w:rPr>
+          <w:noProof/>
+        </w:rPr>
+        <mc:AlternateContent>
+          <mc:Choice Requires="wps">
+            <w:drawing>
+              <wp:anchor distT="0" distB="0" distL="114300" distR="114300" simplePos="0" relativeHeight="251722240" behindDoc="0" locked="0" layoutInCell="1" allowOverlap="1" wp14:anchorId="6ED8EA8B" wp14:editId="63F31686">
+                <wp:simplePos x="0" y="0"/>
+                <wp:positionH relativeFrom="column">
+                  <wp:posOffset>3119755</wp:posOffset>
+                </wp:positionH>
+                <wp:positionV relativeFrom="paragraph">
+                  <wp:posOffset>1277620</wp:posOffset>
+                </wp:positionV>
+                <wp:extent cx="1681480" cy="247650"/>
+                <wp:effectExtent l="0" t="0" r="0" b="0"/>
+                <wp:wrapSquare wrapText="bothSides"/>
+                <wp:docPr id="813854415" name="Szövegdoboz 1"/>
+                <wp:cNvGraphicFramePr/>
+                <a:graphic xmlns:a="http://schemas.openxmlformats.org/drawingml/2006/main">
+                  <a:graphicData uri="http://schemas.microsoft.com/office/word/2010/wordprocessingShape">
+                    <wps:wsp>
+                      <wps:cNvSpPr txBox="1"/>
+                      <wps:spPr>
+                        <a:xfrm>
+                          <a:off x="0" y="0"/>
+                          <a:ext cx="1681480" cy="247650"/>
+                        </a:xfrm>
+                        <a:prstGeom prst="rect">
+                          <a:avLst/>
+                        </a:prstGeom>
+                        <a:solidFill>
+                          <a:prstClr val="white"/>
+                        </a:solidFill>
+                        <a:ln>
+                          <a:noFill/>
+                        </a:ln>
+                      </wps:spPr>
+                      <wps:txbx>
+                        <w:txbxContent>
+                          <w:p>
+                            <w:pPr>
+                              <w:pStyle w:val="Kpalrs"/>
+                              <w:jc w:val="center"/>
+                              <w:rPr>
+                                <w:noProof/>
+                                <w:sz w:val="22"/>
+                                <w:szCs w:val="22"/>
+                              </w:rPr>
+                            </w:pPr>
+                            <w:r>
+                              <w:rPr>
+                                <w:noProof/>
+                              </w:rPr>
+                              <w:t>1</w:t>
+                            </w:r>
+                            <w:r>
+                              <w:rPr>
+                                <w:noProof/>
+                              </w:rPr>
+                              <w:t>5</w:t>
+                            </w:r>
+                            <w:r>
+                              <w:t>. ábra: Email módosítása</w:t>
+                            </w:r>
+                          </w:p>
+                        </w:txbxContent>
+                      </wps:txbx>
+                      <wps:bodyPr rot="0" spcFirstLastPara="0" vertOverflow="overflow" horzOverflow="overflow" vert="horz" wrap="square" lIns="0" tIns="0" rIns="0" bIns="0" numCol="1" spcCol="0" rtlCol="0" fromWordArt="0" anchor="t" anchorCtr="0" forceAA="0" compatLnSpc="1">
+                        <a:prstTxWarp prst="textNoShape">
+                          <a:avLst/>
+                        </a:prstTxWarp>
+                        <a:noAutofit/>
+                      </wps:bodyPr>
+                    </wps:wsp>
+                  </a:graphicData>
+                </a:graphic>
+                <wp14:sizeRelV relativeFrom="margin">
+                  <wp14:pctHeight>0</wp14:pctHeight>
+                </wp14:sizeRelV>
+              </wp:anchor>
+            </w:drawing>
+          </mc:Choice>
+          <mc:Fallback>
+            <w:pict>
+              <v:shape w14:anchorId="6ED8EA8B" id="_x0000_s1040" type="#_x0000_t202" style="position:absolute;margin-left:245.65pt;margin-top:100.6pt;width:132.4pt;height:19.5pt;z-index:251722240;visibility:visible;mso-wrap-style:square;mso-height-percent:0;mso-wrap-distance-left:9pt;mso-wrap-distance-top:0;mso-wrap-distance-right:9pt;mso-wrap-distance-bottom:0;mso-position-horizontal:absolute;mso-position-horizontal-relative:text;mso-position-vertical:absolute;mso-position-vertical-relative:text;mso-height-percent:0;mso-height-relative:margin;v-text-anchor:top" o:gfxdata="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" stroked="f">
+                <v:textbox inset="0,0,0,0">
+                  <w:txbxContent>
+                    <w:p>
+                      <w:pPr>
+                        <w:pStyle w:val="Kpalrs"/>
+                        <w:jc w:val="center"/>
+                        <w:rPr>
+                          <w:noProof/>
+                          <w:sz w:val="22"/>
+                          <w:szCs w:val="22"/>
+                        </w:rPr>
+                      </w:pPr>
+                      <w:r>
+                        <w:rPr>
+                          <w:noProof/>
+                        </w:rPr>
+                        <w:t>1</w:t>
+                      </w:r>
+                      <w:r>
+                        <w:rPr>
+                          <w:noProof/>
+                        </w:rPr>
+                        <w:t>5</w:t>
+                      </w:r>
+                      <w:r>
+                        <w:t>. ábra: Email módosítása</w:t>
+                      </w:r>
+                    </w:p>
+                  </w:txbxContent>
+                </v:textbox>
+                <w10:wrap type="square"/>
+              </v:shape>
+            </w:pict>
+          </mc:Fallback>
+        </mc:AlternateContent>
+      </w:r>
+      <w:r>
+        <w:rPr>
+          <w:noProof/>
+        </w:rPr>
+        <mc:AlternateContent>
+          <mc:Choice Requires="wps">
+            <w:drawing>
+              <wp:anchor distT="0" distB="0" distL="114300" distR="114300" simplePos="0" relativeHeight="251720192" behindDoc="0" locked="0" layoutInCell="1" allowOverlap="1" wp14:anchorId="44181876" wp14:editId="50F4C767">
+                <wp:simplePos x="0" y="0"/>
+                <wp:positionH relativeFrom="column">
+                  <wp:posOffset>1414780</wp:posOffset>
+                </wp:positionH>
+                <wp:positionV relativeFrom="paragraph">
+                  <wp:posOffset>1287145</wp:posOffset>
+                </wp:positionV>
+                <wp:extent cx="1614805" cy="200025"/>
+                <wp:effectExtent l="0" t="0" r="4445" b="9525"/>
                 <wp:wrapSquare wrapText="bothSides"/>
                 <wp:docPr id="923188651" name="Szövegdoboz 1"/>
                 <wp:cNvGraphicFramePr/>
@@ -7929,7 +8405,7 @@
                       <wps:spPr>
                         <a:xfrm>
                           <a:off x="0" y="0"/>
-                          <a:ext cx="1614805" cy="635"/>
+                          <a:ext cx="1614805" cy="200025"/>
                         </a:xfrm>
                         <a:prstGeom prst="rect">
                           <a:avLst/>
@@ -7975,7 +8451,7 @@
                         <a:prstTxWarp prst="textNoShape">
                           <a:avLst/>
                         </a:prstTxWarp>
-                        <a:spAutoFit/>
+                        <a:noAutofit/>
                       </wps:bodyPr>
                     </wps:wsp>
                   </a:graphicData>
@@ -7983,13 +8459,16 @@
                 <wp14:sizeRelH relativeFrom="margin">
                   <wp14:pctWidth>0</wp14:pctWidth>
                 </wp14:sizeRelH>
+                <wp14:sizeRelV relativeFrom="margin">
+                  <wp14:pctHeight>0</wp14:pctHeight>
+                </wp14:sizeRelV>
               </wp:anchor>
             </w:drawing>
           </mc:Choice>
           <mc:Fallback>
             <w:pict>
-              <v:shape w14:anchorId="44181876" id="_x0000_s1039" type="#_x0000_t202" style="position:absolute;margin-left:111.45pt;margin-top:309.25pt;width:127.15pt;height:.05pt;z-index:251720192;visibility:visible;mso-wrap-style:square;mso-width-percent:0;mso-wrap-distance-left:9pt;mso-wrap-distance-top:0;mso-wrap-distance-right:9pt;mso-wrap-distance-bottom:0;mso-position-horizontal:absolute;mso-position-horizontal-relative:text;mso-position-vertical:absolute;mso-position-vertical-relative:text;mso-width-percent:0;mso-width-relative:margin;v-text-anchor:top" o:gfxdata="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" stroked="f">
-                <v:textbox style="mso-fit-shape-to-text:t" inset="0,0,0,0">
+              <v:shape w14:anchorId="44181876" id="_x0000_s1041" type="#_x0000_t202" style="position:absolute;margin-left:111.4pt;margin-top:101.35pt;width:127.15pt;height:15.75pt;z-index:251720192;visibility:visible;mso-wrap-style:square;mso-width-percent:0;mso-height-percent:0;mso-wrap-distance-left:9pt;mso-wrap-distance-top:0;mso-wrap-distance-right:9pt;mso-wrap-distance-bottom:0;mso-position-horizontal:absolute;mso-position-horizontal-relative:text;mso-position-vertical:absolute;mso-position-vertical-relative:text;mso-width-percent:0;mso-height-percent:0;mso-width-relative:margin;mso-height-relative:margin;v-text-anchor:top" o:gfxdata="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" stroked="f">
+                <v:textbox inset="0,0,0,0">
                   <w:txbxContent>
                     <w:p>
                       <w:pPr>
@@ -8027,550 +8506,21 @@
       </w:r>
       <w:r>
         <w:rPr>
-          <w:rFonts w:ascii="Times New Roman" w:hAnsi="Times New Roman" w:cs="Times New Roman"/>
-          <w:noProof/>
-          <w:sz w:val="24"/>
-          <w:szCs w:val="24"/>
-        </w:rPr>
-        <w:drawing>
-          <wp:anchor distT="0" distB="0" distL="114300" distR="114300" simplePos="0" relativeHeight="251713024" behindDoc="0" locked="0" layoutInCell="1" allowOverlap="1" wp14:anchorId="42D9D1DF" wp14:editId="2DED5BF0">
-            <wp:simplePos x="0" y="0"/>
-            <wp:positionH relativeFrom="column">
-              <wp:posOffset>4841240</wp:posOffset>
-            </wp:positionH>
-            <wp:positionV relativeFrom="paragraph">
-              <wp:posOffset>2788158</wp:posOffset>
-            </wp:positionV>
-            <wp:extent cx="1466215" cy="1133475"/>
-            <wp:effectExtent l="190500" t="190500" r="191135" b="200025"/>
-            <wp:wrapSquare wrapText="bothSides"/>
-            <wp:docPr id="631480940" name="Kép 1"/>
-            <wp:cNvGraphicFramePr>
-              <a:graphicFrameLocks xmlns:a="http://schemas.openxmlformats.org/drawingml/2006/main" noChangeAspect="1"/>
-            </wp:cNvGraphicFramePr>
-            <a:graphic xmlns:a="http://schemas.openxmlformats.org/drawingml/2006/main">
-              <a:graphicData uri="http://schemas.openxmlformats.org/drawingml/2006/picture">
-                <pic:pic xmlns:pic="http://schemas.openxmlformats.org/drawingml/2006/picture">
-                  <pic:nvPicPr>
-                    <pic:cNvPr id="631480940" name=""/>
-                    <pic:cNvPicPr/>
-                  </pic:nvPicPr>
-                  <pic:blipFill>
-                    <a:blip r:embed="rId31" cstate="print">
-                      <a:extLst>
-                        <a:ext uri="{28A0092B-C50C-407E-A947-70E740481C1C}">
-                          <a14:useLocalDpi xmlns:a14="http://schemas.microsoft.com/office/drawing/2010/main" val="0"/>
-                        </a:ext>
-                      </a:extLst>
-                    </a:blip>
-                    <a:stretch>
-                      <a:fillRect/>
-                    </a:stretch>
-                  </pic:blipFill>
-                  <pic:spPr>
-                    <a:xfrm>
-                      <a:off x="0" y="0"/>
-                      <a:ext cx="1466215" cy="1133475"/>
-                    </a:xfrm>
-                    <a:prstGeom prst="rect">
-                      <a:avLst/>
-                    </a:prstGeom>
-                    <a:ln>
-                      <a:noFill/>
-                    </a:ln>
-                    <a:effectLst>
-                      <a:outerShdw blurRad="190500" algn="tl" rotWithShape="0">
-                        <a:srgbClr val="000000">
-                          <a:alpha val="70000"/>
-                        </a:srgbClr>
-                      </a:outerShdw>
-                    </a:effectLst>
-                  </pic:spPr>
-                </pic:pic>
-              </a:graphicData>
-            </a:graphic>
-            <wp14:sizeRelH relativeFrom="margin">
-              <wp14:pctWidth>0</wp14:pctWidth>
-            </wp14:sizeRelH>
-            <wp14:sizeRelV relativeFrom="margin">
-              <wp14:pctHeight>0</wp14:pctHeight>
-            </wp14:sizeRelV>
-          </wp:anchor>
-        </w:drawing>
-      </w:r>
-      <w:r>
-        <w:rPr>
           <w:noProof/>
         </w:rPr>
         <mc:AlternateContent>
           <mc:Choice Requires="wps">
             <w:drawing>
-              <wp:anchor distT="0" distB="0" distL="114300" distR="114300" simplePos="0" relativeHeight="251724288" behindDoc="0" locked="0" layoutInCell="1" allowOverlap="1" wp14:anchorId="0B662D61" wp14:editId="652B5E70">
+              <wp:anchor distT="0" distB="0" distL="114300" distR="114300" simplePos="0" relativeHeight="251718144" behindDoc="0" locked="0" layoutInCell="1" allowOverlap="1" wp14:anchorId="19C28025" wp14:editId="1D0CBCE0">
                 <wp:simplePos x="0" y="0"/>
                 <wp:positionH relativeFrom="column">
-                  <wp:posOffset>4841240</wp:posOffset>
+                  <wp:posOffset>-328295</wp:posOffset>
                 </wp:positionH>
                 <wp:positionV relativeFrom="paragraph">
-                  <wp:posOffset>3944315</wp:posOffset>
+                  <wp:posOffset>1296035</wp:posOffset>
                 </wp:positionV>
-                <wp:extent cx="1466215" cy="635"/>
-                <wp:effectExtent l="0" t="0" r="0" b="0"/>
-                <wp:wrapSquare wrapText="bothSides"/>
-                <wp:docPr id="1752795455" name="Szövegdoboz 1"/>
-                <wp:cNvGraphicFramePr/>
-                <a:graphic xmlns:a="http://schemas.openxmlformats.org/drawingml/2006/main">
-                  <a:graphicData uri="http://schemas.microsoft.com/office/word/2010/wordprocessingShape">
-                    <wps:wsp>
-                      <wps:cNvSpPr txBox="1"/>
-                      <wps:spPr>
-                        <a:xfrm>
-                          <a:off x="0" y="0"/>
-                          <a:ext cx="1466215" cy="635"/>
-                        </a:xfrm>
-                        <a:prstGeom prst="rect">
-                          <a:avLst/>
-                        </a:prstGeom>
-                        <a:solidFill>
-                          <a:prstClr val="white"/>
-                        </a:solidFill>
-                        <a:ln>
-                          <a:noFill/>
-                        </a:ln>
-                      </wps:spPr>
-                      <wps:txbx>
-                        <w:txbxContent>
-                          <w:p>
-                            <w:pPr>
-                              <w:pStyle w:val="Kpalrs"/>
-                              <w:jc w:val="center"/>
-                              <w:rPr>
-                                <w:noProof/>
-                                <w:sz w:val="22"/>
-                                <w:szCs w:val="22"/>
-                              </w:rPr>
-                            </w:pPr>
-                            <w:r>
-                              <w:rPr>
-                                <w:noProof/>
-                              </w:rPr>
-                              <w:t>1</w:t>
-                            </w:r>
-                            <w:r>
-                              <w:rPr>
-                                <w:noProof/>
-                              </w:rPr>
-                              <w:t>6</w:t>
-                            </w:r>
-                            <w:r>
-                              <w:t>. ábra: Jelszó módosítása</w:t>
-                            </w:r>
-                          </w:p>
-                        </w:txbxContent>
-                      </wps:txbx>
-                      <wps:bodyPr rot="0" spcFirstLastPara="0" vertOverflow="overflow" horzOverflow="overflow" vert="horz" wrap="square" lIns="0" tIns="0" rIns="0" bIns="0" numCol="1" spcCol="0" rtlCol="0" fromWordArt="0" anchor="t" anchorCtr="0" forceAA="0" compatLnSpc="1">
-                        <a:prstTxWarp prst="textNoShape">
-                          <a:avLst/>
-                        </a:prstTxWarp>
-                        <a:spAutoFit/>
-                      </wps:bodyPr>
-                    </wps:wsp>
-                  </a:graphicData>
-                </a:graphic>
-              </wp:anchor>
-            </w:drawing>
-          </mc:Choice>
-          <mc:Fallback>
-            <w:pict>
-              <v:shape w14:anchorId="0B662D61" id="_x0000_s1040" type="#_x0000_t202" style="position:absolute;margin-left:381.2pt;margin-top:310.6pt;width:115.45pt;height:.05pt;z-index:251724288;visibility:visible;mso-wrap-style:square;mso-wrap-distance-left:9pt;mso-wrap-distance-top:0;mso-wrap-distance-right:9pt;mso-wrap-distance-bottom:0;mso-position-horizontal:absolute;mso-position-horizontal-relative:text;mso-position-vertical:absolute;mso-position-vertical-relative:text;v-text-anchor:top" o:gfxdata="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" stroked="f">
-                <v:textbox style="mso-fit-shape-to-text:t" inset="0,0,0,0">
-                  <w:txbxContent>
-                    <w:p>
-                      <w:pPr>
-                        <w:pStyle w:val="Kpalrs"/>
-                        <w:jc w:val="center"/>
-                        <w:rPr>
-                          <w:noProof/>
-                          <w:sz w:val="22"/>
-                          <w:szCs w:val="22"/>
-                        </w:rPr>
-                      </w:pPr>
-                      <w:r>
-                        <w:rPr>
-                          <w:noProof/>
-                        </w:rPr>
-                        <w:t>1</w:t>
-                      </w:r>
-                      <w:r>
-                        <w:rPr>
-                          <w:noProof/>
-                        </w:rPr>
-                        <w:t>6</w:t>
-                      </w:r>
-                      <w:r>
-                        <w:t>. ábra: Jelszó módosítása</w:t>
-                      </w:r>
-                    </w:p>
-                  </w:txbxContent>
-                </v:textbox>
-                <w10:wrap type="square"/>
-              </v:shape>
-            </w:pict>
-          </mc:Fallback>
-        </mc:AlternateContent>
-      </w:r>
-      <w:r>
-        <w:rPr>
-          <w:noProof/>
-        </w:rPr>
-        <w:drawing>
-          <wp:anchor distT="0" distB="0" distL="114300" distR="114300" simplePos="0" relativeHeight="251714048" behindDoc="0" locked="0" layoutInCell="1" allowOverlap="1" wp14:anchorId="22F1B5FA" wp14:editId="13244CFC">
-            <wp:simplePos x="0" y="0"/>
-            <wp:positionH relativeFrom="column">
-              <wp:posOffset>3115945</wp:posOffset>
-            </wp:positionH>
-            <wp:positionV relativeFrom="paragraph">
-              <wp:posOffset>2937281</wp:posOffset>
-            </wp:positionV>
-            <wp:extent cx="1681480" cy="995680"/>
-            <wp:effectExtent l="190500" t="190500" r="185420" b="185420"/>
-            <wp:wrapSquare wrapText="bothSides"/>
-            <wp:docPr id="2080885197" name="Kép 1"/>
-            <wp:cNvGraphicFramePr>
-              <a:graphicFrameLocks xmlns:a="http://schemas.openxmlformats.org/drawingml/2006/main" noChangeAspect="1"/>
-            </wp:cNvGraphicFramePr>
-            <a:graphic xmlns:a="http://schemas.openxmlformats.org/drawingml/2006/main">
-              <a:graphicData uri="http://schemas.openxmlformats.org/drawingml/2006/picture">
-                <pic:pic xmlns:pic="http://schemas.openxmlformats.org/drawingml/2006/picture">
-                  <pic:nvPicPr>
-                    <pic:cNvPr id="2080885197" name=""/>
-                    <pic:cNvPicPr/>
-                  </pic:nvPicPr>
-                  <pic:blipFill rotWithShape="1">
-                    <a:blip r:embed="rId32" cstate="print">
-                      <a:extLst>
-                        <a:ext uri="{28A0092B-C50C-407E-A947-70E740481C1C}">
-                          <a14:useLocalDpi xmlns:a14="http://schemas.microsoft.com/office/drawing/2010/main" val="0"/>
-                        </a:ext>
-                      </a:extLst>
-                    </a:blip>
-                    <a:srcRect t="1447"/>
-                    <a:stretch>
-                      <a:fillRect/>
-                    </a:stretch>
-                  </pic:blipFill>
-                  <pic:spPr bwMode="auto">
-                    <a:xfrm>
-                      <a:off x="0" y="0"/>
-                      <a:ext cx="1681480" cy="995680"/>
-                    </a:xfrm>
-                    <a:prstGeom prst="rect">
-                      <a:avLst/>
-                    </a:prstGeom>
-                    <a:ln>
-                      <a:noFill/>
-                    </a:ln>
-                    <a:effectLst>
-                      <a:outerShdw blurRad="190500" algn="tl" rotWithShape="0">
-                        <a:srgbClr val="000000">
-                          <a:alpha val="70000"/>
-                        </a:srgbClr>
-                      </a:outerShdw>
-                    </a:effectLst>
-                    <a:extLst>
-                      <a:ext uri="{53640926-AAD7-44D8-BBD7-CCE9431645EC}">
-                        <a14:shadowObscured xmlns:a14="http://schemas.microsoft.com/office/drawing/2010/main"/>
-                      </a:ext>
-                    </a:extLst>
-                  </pic:spPr>
-                </pic:pic>
-              </a:graphicData>
-            </a:graphic>
-            <wp14:sizeRelH relativeFrom="margin">
-              <wp14:pctWidth>0</wp14:pctWidth>
-            </wp14:sizeRelH>
-            <wp14:sizeRelV relativeFrom="margin">
-              <wp14:pctHeight>0</wp14:pctHeight>
-            </wp14:sizeRelV>
-          </wp:anchor>
-        </w:drawing>
-      </w:r>
-      <w:r>
-        <w:rPr>
-          <w:noProof/>
-        </w:rPr>
-        <mc:AlternateContent>
-          <mc:Choice Requires="wps">
-            <w:drawing>
-              <wp:anchor distT="0" distB="0" distL="114300" distR="114300" simplePos="0" relativeHeight="251722240" behindDoc="0" locked="0" layoutInCell="1" allowOverlap="1" wp14:anchorId="6ED8EA8B" wp14:editId="1E559B38">
-                <wp:simplePos x="0" y="0"/>
-                <wp:positionH relativeFrom="column">
-                  <wp:posOffset>3115945</wp:posOffset>
-                </wp:positionH>
-                <wp:positionV relativeFrom="paragraph">
-                  <wp:posOffset>3919627</wp:posOffset>
-                </wp:positionV>
-                <wp:extent cx="1681480" cy="635"/>
-                <wp:effectExtent l="0" t="0" r="0" b="0"/>
-                <wp:wrapSquare wrapText="bothSides"/>
-                <wp:docPr id="813854415" name="Szövegdoboz 1"/>
-                <wp:cNvGraphicFramePr/>
-                <a:graphic xmlns:a="http://schemas.openxmlformats.org/drawingml/2006/main">
-                  <a:graphicData uri="http://schemas.microsoft.com/office/word/2010/wordprocessingShape">
-                    <wps:wsp>
-                      <wps:cNvSpPr txBox="1"/>
-                      <wps:spPr>
-                        <a:xfrm>
-                          <a:off x="0" y="0"/>
-                          <a:ext cx="1681480" cy="635"/>
-                        </a:xfrm>
-                        <a:prstGeom prst="rect">
-                          <a:avLst/>
-                        </a:prstGeom>
-                        <a:solidFill>
-                          <a:prstClr val="white"/>
-                        </a:solidFill>
-                        <a:ln>
-                          <a:noFill/>
-                        </a:ln>
-                      </wps:spPr>
-                      <wps:txbx>
-                        <w:txbxContent>
-                          <w:p>
-                            <w:pPr>
-                              <w:pStyle w:val="Kpalrs"/>
-                              <w:jc w:val="center"/>
-                              <w:rPr>
-                                <w:noProof/>
-                                <w:sz w:val="22"/>
-                                <w:szCs w:val="22"/>
-                              </w:rPr>
-                            </w:pPr>
-                            <w:r>
-                              <w:rPr>
-                                <w:noProof/>
-                              </w:rPr>
-                              <w:t>1</w:t>
-                            </w:r>
-                            <w:r>
-                              <w:rPr>
-                                <w:noProof/>
-                              </w:rPr>
-                              <w:t>5</w:t>
-                            </w:r>
-                            <w:r>
-                              <w:t>. ábra: Email módosítása</w:t>
-                            </w:r>
-                          </w:p>
-                        </w:txbxContent>
-                      </wps:txbx>
-                      <wps:bodyPr rot="0" spcFirstLastPara="0" vertOverflow="overflow" horzOverflow="overflow" vert="horz" wrap="square" lIns="0" tIns="0" rIns="0" bIns="0" numCol="1" spcCol="0" rtlCol="0" fromWordArt="0" anchor="t" anchorCtr="0" forceAA="0" compatLnSpc="1">
-                        <a:prstTxWarp prst="textNoShape">
-                          <a:avLst/>
-                        </a:prstTxWarp>
-                        <a:spAutoFit/>
-                      </wps:bodyPr>
-                    </wps:wsp>
-                  </a:graphicData>
-                </a:graphic>
-              </wp:anchor>
-            </w:drawing>
-          </mc:Choice>
-          <mc:Fallback>
-            <w:pict>
-              <v:shape w14:anchorId="6ED8EA8B" id="_x0000_s1041" type="#_x0000_t202" style="position:absolute;margin-left:245.35pt;margin-top:308.65pt;width:132.4pt;height:.05pt;z-index:251722240;visibility:visible;mso-wrap-style:square;mso-wrap-distance-left:9pt;mso-wrap-distance-top:0;mso-wrap-distance-right:9pt;mso-wrap-distance-bottom:0;mso-position-horizontal:absolute;mso-position-horizontal-relative:text;mso-position-vertical:absolute;mso-position-vertical-relative:text;v-text-anchor:top" o:gfxdata="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" stroked="f">
-                <v:textbox style="mso-fit-shape-to-text:t" inset="0,0,0,0">
-                  <w:txbxContent>
-                    <w:p>
-                      <w:pPr>
-                        <w:pStyle w:val="Kpalrs"/>
-                        <w:jc w:val="center"/>
-                        <w:rPr>
-                          <w:noProof/>
-                          <w:sz w:val="22"/>
-                          <w:szCs w:val="22"/>
-                        </w:rPr>
-                      </w:pPr>
-                      <w:r>
-                        <w:rPr>
-                          <w:noProof/>
-                        </w:rPr>
-                        <w:t>1</w:t>
-                      </w:r>
-                      <w:r>
-                        <w:rPr>
-                          <w:noProof/>
-                        </w:rPr>
-                        <w:t>5</w:t>
-                      </w:r>
-                      <w:r>
-                        <w:t>. ábra: Email módosítása</w:t>
-                      </w:r>
-                    </w:p>
-                  </w:txbxContent>
-                </v:textbox>
-                <w10:wrap type="square"/>
-              </v:shape>
-            </w:pict>
-          </mc:Fallback>
-        </mc:AlternateContent>
-      </w:r>
-      <w:r>
-        <w:rPr>
-          <w:noProof/>
-        </w:rPr>
-        <w:drawing>
-          <wp:anchor distT="0" distB="0" distL="114300" distR="114300" simplePos="0" relativeHeight="251715072" behindDoc="0" locked="0" layoutInCell="1" allowOverlap="1" wp14:anchorId="12F9CCDF" wp14:editId="5A2503EE">
-            <wp:simplePos x="0" y="0"/>
-            <wp:positionH relativeFrom="column">
-              <wp:posOffset>1401445</wp:posOffset>
-            </wp:positionH>
-            <wp:positionV relativeFrom="paragraph">
-              <wp:posOffset>2919654</wp:posOffset>
-            </wp:positionV>
-            <wp:extent cx="1644650" cy="997585"/>
-            <wp:effectExtent l="190500" t="190500" r="184150" b="183515"/>
-            <wp:wrapSquare wrapText="bothSides"/>
-            <wp:docPr id="750999690" name="Kép 1"/>
-            <wp:cNvGraphicFramePr>
-              <a:graphicFrameLocks xmlns:a="http://schemas.openxmlformats.org/drawingml/2006/main" noChangeAspect="1"/>
-            </wp:cNvGraphicFramePr>
-            <a:graphic xmlns:a="http://schemas.openxmlformats.org/drawingml/2006/main">
-              <a:graphicData uri="http://schemas.openxmlformats.org/drawingml/2006/picture">
-                <pic:pic xmlns:pic="http://schemas.openxmlformats.org/drawingml/2006/picture">
-                  <pic:nvPicPr>
-                    <pic:cNvPr id="750999690" name=""/>
-                    <pic:cNvPicPr/>
-                  </pic:nvPicPr>
-                  <pic:blipFill>
-                    <a:blip r:embed="rId33" cstate="print">
-                      <a:extLst>
-                        <a:ext uri="{28A0092B-C50C-407E-A947-70E740481C1C}">
-                          <a14:useLocalDpi xmlns:a14="http://schemas.microsoft.com/office/drawing/2010/main" val="0"/>
-                        </a:ext>
-                      </a:extLst>
-                    </a:blip>
-                    <a:stretch>
-                      <a:fillRect/>
-                    </a:stretch>
-                  </pic:blipFill>
-                  <pic:spPr>
-                    <a:xfrm>
-                      <a:off x="0" y="0"/>
-                      <a:ext cx="1644650" cy="997585"/>
-                    </a:xfrm>
-                    <a:prstGeom prst="rect">
-                      <a:avLst/>
-                    </a:prstGeom>
-                    <a:ln>
-                      <a:noFill/>
-                    </a:ln>
-                    <a:effectLst>
-                      <a:outerShdw blurRad="190500" algn="tl" rotWithShape="0">
-                        <a:srgbClr val="000000">
-                          <a:alpha val="70000"/>
-                        </a:srgbClr>
-                      </a:outerShdw>
-                    </a:effectLst>
-                  </pic:spPr>
-                </pic:pic>
-              </a:graphicData>
-            </a:graphic>
-            <wp14:sizeRelH relativeFrom="margin">
-              <wp14:pctWidth>0</wp14:pctWidth>
-            </wp14:sizeRelH>
-            <wp14:sizeRelV relativeFrom="margin">
-              <wp14:pctHeight>0</wp14:pctHeight>
-            </wp14:sizeRelV>
-          </wp:anchor>
-        </w:drawing>
-      </w:r>
-      <w:r>
-        <w:rPr>
-          <w:noProof/>
-        </w:rPr>
-        <w:drawing>
-          <wp:anchor distT="0" distB="0" distL="114300" distR="114300" simplePos="0" relativeHeight="251716096" behindDoc="0" locked="0" layoutInCell="1" allowOverlap="1" wp14:anchorId="32C34153" wp14:editId="0D75CEF9">
-            <wp:simplePos x="0" y="0"/>
-            <wp:positionH relativeFrom="column">
-              <wp:posOffset>-328930</wp:posOffset>
-            </wp:positionH>
-            <wp:positionV relativeFrom="paragraph">
-              <wp:posOffset>2920288</wp:posOffset>
-            </wp:positionV>
-            <wp:extent cx="1676400" cy="990600"/>
-            <wp:effectExtent l="190500" t="190500" r="190500" b="190500"/>
-            <wp:wrapSquare wrapText="bothSides"/>
-            <wp:docPr id="640515945" name="Kép 1"/>
-            <wp:cNvGraphicFramePr>
-              <a:graphicFrameLocks xmlns:a="http://schemas.openxmlformats.org/drawingml/2006/main" noChangeAspect="1"/>
-            </wp:cNvGraphicFramePr>
-            <a:graphic xmlns:a="http://schemas.openxmlformats.org/drawingml/2006/main">
-              <a:graphicData uri="http://schemas.openxmlformats.org/drawingml/2006/picture">
-                <pic:pic xmlns:pic="http://schemas.openxmlformats.org/drawingml/2006/picture">
-                  <pic:nvPicPr>
-                    <pic:cNvPr id="640515945" name=""/>
-                    <pic:cNvPicPr/>
-                  </pic:nvPicPr>
-                  <pic:blipFill>
-                    <a:blip r:embed="rId34" cstate="print">
-                      <a:extLst>
-                        <a:ext uri="{28A0092B-C50C-407E-A947-70E740481C1C}">
-                          <a14:useLocalDpi xmlns:a14="http://schemas.microsoft.com/office/drawing/2010/main" val="0"/>
-                        </a:ext>
-                      </a:extLst>
-                    </a:blip>
-                    <a:stretch>
-                      <a:fillRect/>
-                    </a:stretch>
-                  </pic:blipFill>
-                  <pic:spPr>
-                    <a:xfrm>
-                      <a:off x="0" y="0"/>
-                      <a:ext cx="1676400" cy="990600"/>
-                    </a:xfrm>
-                    <a:prstGeom prst="rect">
-                      <a:avLst/>
-                    </a:prstGeom>
-                    <a:ln>
-                      <a:noFill/>
-                    </a:ln>
-                    <a:effectLst>
-                      <a:outerShdw blurRad="190500" algn="tl" rotWithShape="0">
-                        <a:srgbClr val="000000">
-                          <a:alpha val="70000"/>
-                        </a:srgbClr>
-                      </a:outerShdw>
-                    </a:effectLst>
-                  </pic:spPr>
-                </pic:pic>
-              </a:graphicData>
-            </a:graphic>
-            <wp14:sizeRelH relativeFrom="margin">
-              <wp14:pctWidth>0</wp14:pctWidth>
-            </wp14:sizeRelH>
-            <wp14:sizeRelV relativeFrom="margin">
-              <wp14:pctHeight>0</wp14:pctHeight>
-            </wp14:sizeRelV>
-          </wp:anchor>
-        </w:drawing>
-      </w:r>
-      <w:r>
-        <w:rPr>
-          <w:noProof/>
-        </w:rPr>
-        <mc:AlternateContent>
-          <mc:Choice Requires="wps">
-            <w:drawing>
-              <wp:anchor distT="0" distB="0" distL="114300" distR="114300" simplePos="0" relativeHeight="251718144" behindDoc="0" locked="0" layoutInCell="1" allowOverlap="1" wp14:anchorId="19C28025" wp14:editId="563D6247">
-                <wp:simplePos x="0" y="0"/>
-                <wp:positionH relativeFrom="column">
-                  <wp:posOffset>-328930</wp:posOffset>
-                </wp:positionH>
-                <wp:positionV relativeFrom="paragraph">
-                  <wp:posOffset>3910939</wp:posOffset>
-                </wp:positionV>
-                <wp:extent cx="1676400" cy="635"/>
-                <wp:effectExtent l="0" t="0" r="0" b="0"/>
+                <wp:extent cx="1676400" cy="219075"/>
+                <wp:effectExtent l="0" t="0" r="0" b="9525"/>
                 <wp:wrapSquare wrapText="bothSides"/>
                 <wp:docPr id="1251128021" name="Szövegdoboz 1"/>
                 <wp:cNvGraphicFramePr/>
@@ -8581,7 +8531,7 @@
                       <wps:spPr>
                         <a:xfrm>
                           <a:off x="0" y="0"/>
-                          <a:ext cx="1676400" cy="635"/>
+                          <a:ext cx="1676400" cy="219075"/>
                         </a:xfrm>
                         <a:prstGeom prst="rect">
                           <a:avLst/>
@@ -8627,18 +8577,21 @@
                         <a:prstTxWarp prst="textNoShape">
                           <a:avLst/>
                         </a:prstTxWarp>
-                        <a:spAutoFit/>
+                        <a:noAutofit/>
                       </wps:bodyPr>
                     </wps:wsp>
                   </a:graphicData>
                 </a:graphic>
+                <wp14:sizeRelV relativeFrom="margin">
+                  <wp14:pctHeight>0</wp14:pctHeight>
+                </wp14:sizeRelV>
               </wp:anchor>
             </w:drawing>
           </mc:Choice>
           <mc:Fallback>
             <w:pict>
-              <v:shape w14:anchorId="19C28025" id="_x0000_s1042" type="#_x0000_t202" style="position:absolute;margin-left:-25.9pt;margin-top:307.95pt;width:132pt;height:.05pt;z-index:251718144;visibility:visible;mso-wrap-style:square;mso-wrap-distance-left:9pt;mso-wrap-distance-top:0;mso-wrap-distance-right:9pt;mso-wrap-distance-bottom:0;mso-position-horizontal:absolute;mso-position-horizontal-relative:text;mso-position-vertical:absolute;mso-position-vertical-relative:text;v-text-anchor:top" o:gfxdata="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" stroked="f">
-                <v:textbox style="mso-fit-shape-to-text:t" inset="0,0,0,0">
+              <v:shape w14:anchorId="19C28025" id="_x0000_s1042" type="#_x0000_t202" style="position:absolute;margin-left:-25.85pt;margin-top:102.05pt;width:132pt;height:17.25pt;z-index:251718144;visibility:visible;mso-wrap-style:square;mso-height-percent:0;mso-wrap-distance-left:9pt;mso-wrap-distance-top:0;mso-wrap-distance-right:9pt;mso-wrap-distance-bottom:0;mso-position-horizontal:absolute;mso-position-horizontal-relative:text;mso-position-vertical:absolute;mso-position-vertical-relative:text;mso-height-percent:0;mso-height-relative:margin;v-text-anchor:top" o:gfxdata="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" stroked="f">
+                <v:textbox inset="0,0,0,0">
                   <w:txbxContent>
                     <w:p>
                       <w:pPr>
@@ -8674,88 +8627,6 @@
           </mc:Fallback>
         </mc:AlternateContent>
       </w:r>
-      <w:r>
-        <w:rPr>
-          <w:rFonts w:ascii="Times New Roman" w:hAnsi="Times New Roman" w:cs="Times New Roman"/>
-          <w:sz w:val="24"/>
-          <w:szCs w:val="24"/>
-        </w:rPr>
-        <w:t>A „Profil beállítások” gombra kattintva megjelenő felületek a képen látható menü fogadja a felhasználót. Profiljának négy tulajdonságát módosíthatja.</w:t>
-      </w:r>
-      <w:r>
-        <w:rPr>
-          <w:noProof/>
-        </w:rPr>
-        <w:t xml:space="preserve"> </w:t>
-      </w:r>
-      <w:r>
-        <w:rPr>
-          <w:rFonts w:ascii="Times New Roman" w:hAnsi="Times New Roman" w:cs="Times New Roman"/>
-          <w:noProof/>
-          <w:sz w:val="24"/>
-          <w:szCs w:val="24"/>
-        </w:rPr>
-        <w:t>Ezekre a gombokra kattintva négy különböző űrlap jelenik meg, amelyben megadva friss adatait a „Mentés” gombra kattintva elmentheti a feelhasználó, legközelebbi bejelentkezés alkalmával már ezeket használhatja.</w:t>
-      </w:r>
-      <w:r>
-        <w:rPr>
-          <w:rFonts w:ascii="Times New Roman" w:hAnsi="Times New Roman" w:cs="Times New Roman"/>
-          <w:noProof/>
-          <w:sz w:val="24"/>
-          <w:szCs w:val="24"/>
-        </w:rPr>
-        <w:t xml:space="preserve"> Ha a fiók jelszavát szeretné módosítani, előbb meg kell adni a régi jelszót, ha ez hibás, nem lehet</w:t>
-      </w:r>
-      <w:r>
-        <w:rPr>
-          <w:rFonts w:ascii="Times New Roman" w:hAnsi="Times New Roman" w:cs="Times New Roman"/>
-          <w:noProof/>
-          <w:sz w:val="24"/>
-          <w:szCs w:val="24"/>
-        </w:rPr>
-        <w:t xml:space="preserve"> </w:t>
-      </w:r>
-      <w:r>
-        <w:rPr>
-          <w:rFonts w:ascii="Times New Roman" w:hAnsi="Times New Roman" w:cs="Times New Roman"/>
-          <w:noProof/>
-          <w:sz w:val="24"/>
-          <w:szCs w:val="24"/>
-        </w:rPr>
-        <w:t>módosítani.</w:t>
-      </w:r>
-    </w:p>
-    <w:p>
-      <w:pPr>
-        <w:spacing w:line="360" w:lineRule="auto"/>
-        <w:rPr>
-          <w:rFonts w:ascii="Times New Roman" w:hAnsi="Times New Roman" w:cs="Times New Roman"/>
-          <w:noProof/>
-          <w:sz w:val="24"/>
-          <w:szCs w:val="24"/>
-        </w:rPr>
-      </w:pPr>
-    </w:p>
-    <w:p>
-      <w:pPr>
-        <w:spacing w:line="360" w:lineRule="auto"/>
-        <w:rPr>
-          <w:rFonts w:ascii="Times New Roman" w:hAnsi="Times New Roman" w:cs="Times New Roman"/>
-          <w:noProof/>
-          <w:sz w:val="24"/>
-          <w:szCs w:val="24"/>
-        </w:rPr>
-      </w:pPr>
-    </w:p>
-    <w:p>
-      <w:pPr>
-        <w:rPr>
-          <w:rFonts w:ascii="Times New Roman" w:hAnsi="Times New Roman" w:cs="Times New Roman"/>
-          <w:noProof/>
-          <w:sz w:val="24"/>
-          <w:szCs w:val="24"/>
-        </w:rPr>
-      </w:pPr>
       <w:r>
         <w:rPr>
           <w:rFonts w:ascii="Times New Roman" w:hAnsi="Times New Roman" w:cs="Times New Roman"/>

</xml_diff>